<commit_message>
Add paper recovery and revision artifacts
</commit_message>
<xml_diff>
--- a/true_paper/paper.docx
+++ b/true_paper/paper.docx
@@ -5,17 +5,16 @@
     <w:p>
       <w:pPr>
         <w:rPr>
-          <w:rFonts w:hint="eastAsia"/>
+          <w:b/>
+          <w:bCs/>
         </w:rPr>
       </w:pPr>
       <w:r>
-        <w:t>T</w:t>
-      </w:r>
-      <w:r>
-        <w:rPr>
-          <w:rFonts w:hint="eastAsia"/>
-        </w:rPr>
-        <w:t>itle</w:t>
+        <w:rPr>
+          <w:b/>
+          <w:bCs/>
+        </w:rPr>
+        <w:t>Evaluating Recommendation-Tuned LLMs Across Task Formulations and Training Exposure</w:t>
       </w:r>
     </w:p>
     <w:p>
@@ -115,25 +114,10 @@
       </w:r>
       <w:proofErr w:type="spellEnd"/>
       <w:r>
-        <w:t>. On</w:t>
-      </w:r>
-      <w:r>
-        <w:rPr>
-          <w:rFonts w:hint="eastAsia"/>
-        </w:rPr>
-        <w:t xml:space="preserve"> </w:t>
-      </w:r>
-      <w:r>
-        <w:t xml:space="preserve">MovieLens-1M, we </w:t>
-      </w:r>
-      <w:r>
-        <w:rPr>
-          <w:rFonts w:hint="eastAsia"/>
-        </w:rPr>
-        <w:t xml:space="preserve">evaluate Y and N on both tasks, </w:t>
-      </w:r>
-      <w:r>
-        <w:t>track their performance as cumulative task-sample exposure increases, and compare M1 with the corresponding task-specific models at matched exposure.</w:t>
+        <w:t xml:space="preserve">. </w:t>
+      </w:r>
+      <w:r>
+        <w:t>On MovieLens-1M, we compare Y and N on their native tasks, additionally evaluate Y as a next-interaction ranker, track their performance as cumulative task-sample exposure increases, and compare M1 with the corresponding task-specific models at matched exposure.</w:t>
       </w:r>
       <w:r>
         <w:rPr>
@@ -194,16 +178,10 @@
         <w:t>nd</w:t>
       </w:r>
       <w:r>
-        <w:t xml:space="preserve"> the size of the gap depends on the candidate protocol. The N-trained </w:t>
-      </w:r>
-      <w:r>
-        <w:rPr>
-          <w:rFonts w:hint="eastAsia"/>
-        </w:rPr>
-        <w:t>LLM</w:t>
-      </w:r>
-      <w:r>
-        <w:t xml:space="preserve"> also outperforms the evaluated </w:t>
+        <w:t xml:space="preserve"> the size of the gap depends on the candidate protocol. </w:t>
+      </w:r>
+      <w:r>
+        <w:t xml:space="preserve">The N-trained LLM outperforms the evaluated </w:t>
       </w:r>
       <w:proofErr w:type="spellStart"/>
       <w:r>
@@ -211,45 +189,758 @@
       </w:r>
       <w:proofErr w:type="spellEnd"/>
       <w:r>
-        <w:t xml:space="preserve"> baseline at all four approximately matched exposure points, with the difference narrowing as </w:t>
-      </w:r>
-      <w:proofErr w:type="spellStart"/>
-      <w:r>
+        <w:t xml:space="preserve"> baseline at all four approximately matched exposure points, while the gap is smaller at the largest exposure.</w:t>
+      </w:r>
+      <w:r>
+        <w:t xml:space="preserve"> The available earlier operating point on Amazon shows the same ranking direction.</w:t>
+      </w:r>
+    </w:p>
+    <w:p>
+      <w:pPr>
+        <w:rPr>
+          <w:b/>
+          <w:bCs/>
+        </w:rPr>
+      </w:pPr>
+      <w:r>
+        <w:rPr>
+          <w:b/>
+          <w:bCs/>
+        </w:rPr>
+        <w:t>I. INTRODUCTION</w:t>
+      </w:r>
+    </w:p>
+    <w:p>
+      <w:pPr>
+        <w:rPr>
+          <w:sz w:val="21"/>
+          <w:szCs w:val="21"/>
+        </w:rPr>
+      </w:pPr>
+      <w:r>
+        <w:rPr>
+          <w:sz w:val="21"/>
+          <w:szCs w:val="21"/>
+        </w:rPr>
+        <w:t>Large language models (LLMs) have been applied to recommendation in increasingly diverse ways, including conversational recommendation, candidate ranking, and recommendation-specific fine-tuning [1]</w:t>
+      </w:r>
+      <w:proofErr w:type="gramStart"/>
+      <w:r>
+        <w:rPr>
+          <w:sz w:val="21"/>
+          <w:szCs w:val="21"/>
+        </w:rPr>
+        <w:t>–[</w:t>
+      </w:r>
+      <w:proofErr w:type="gramEnd"/>
+      <w:r>
+        <w:rPr>
+          <w:sz w:val="21"/>
+          <w:szCs w:val="21"/>
+        </w:rPr>
+        <w:t>4]. A major appeal of this line of work is that different recommendation tasks can be expressed through a common language-model interface. However, a shared interface does not imply a shared prediction objective. Models trained through similar prompts may still receive different supervision and</w:t>
+      </w:r>
+      <w:r>
+        <w:rPr>
+          <w:rFonts w:hint="eastAsia"/>
+          <w:sz w:val="21"/>
+          <w:szCs w:val="21"/>
+        </w:rPr>
+        <w:t xml:space="preserve"> </w:t>
+      </w:r>
+      <w:r>
+        <w:rPr>
+          <w:sz w:val="21"/>
+          <w:szCs w:val="21"/>
+        </w:rPr>
+        <w:t>exhibit dif</w:t>
+      </w:r>
+      <w:r>
+        <w:rPr>
+          <w:rFonts w:hint="eastAsia"/>
+          <w:sz w:val="21"/>
+          <w:szCs w:val="21"/>
+        </w:rPr>
+        <w:t>ferent</w:t>
+      </w:r>
+      <w:r>
+        <w:rPr>
+          <w:sz w:val="21"/>
+          <w:szCs w:val="21"/>
+        </w:rPr>
+        <w:t xml:space="preserve"> behavior.</w:t>
+      </w:r>
+    </w:p>
+    <w:p>
+      <w:pPr>
+        <w:rPr>
+          <w:sz w:val="21"/>
+          <w:szCs w:val="21"/>
+        </w:rPr>
+      </w:pPr>
+      <w:r>
+        <w:rPr>
+          <w:sz w:val="21"/>
+          <w:szCs w:val="21"/>
+        </w:rPr>
+        <w:t>Preference prediction and next-interaction prediction provide a representative example. Preference prediction asks whether a user is likely to favor an item, wh</w:t>
+      </w:r>
+      <w:r>
+        <w:rPr>
+          <w:rFonts w:hint="eastAsia"/>
+          <w:sz w:val="21"/>
+          <w:szCs w:val="21"/>
+        </w:rPr>
+        <w:t>ile</w:t>
+      </w:r>
+      <w:r>
+        <w:rPr>
+          <w:sz w:val="21"/>
+          <w:szCs w:val="21"/>
+        </w:rPr>
+        <w:t xml:space="preserve"> next-interaction prediction asks which item will appear next in the observed behavior sequence. </w:t>
+      </w:r>
+      <w:r>
+        <w:rPr>
+          <w:sz w:val="21"/>
+          <w:szCs w:val="21"/>
+        </w:rPr>
+        <w:t>These objectives have long been distinguished in</w:t>
+      </w:r>
+      <w:r>
+        <w:rPr>
+          <w:rFonts w:hint="eastAsia"/>
+          <w:sz w:val="21"/>
+          <w:szCs w:val="21"/>
+        </w:rPr>
+        <w:t xml:space="preserve"> conventional</w:t>
+      </w:r>
+      <w:r>
+        <w:rPr>
+          <w:sz w:val="21"/>
+          <w:szCs w:val="21"/>
+        </w:rPr>
+        <w:t xml:space="preserve"> recommender systems [6], [7], </w:t>
+      </w:r>
+      <w:r>
+        <w:rPr>
+          <w:sz w:val="21"/>
+          <w:szCs w:val="21"/>
+        </w:rPr>
+        <w:t xml:space="preserve">but recent language-based </w:t>
+      </w:r>
+      <w:r>
+        <w:rPr>
+          <w:sz w:val="21"/>
+          <w:szCs w:val="21"/>
+        </w:rPr>
+        <w:lastRenderedPageBreak/>
+        <w:t>frameworks can formulate both through similar text-based prediction interfaces</w:t>
+      </w:r>
+      <w:r>
+        <w:rPr>
+          <w:sz w:val="21"/>
+          <w:szCs w:val="21"/>
+        </w:rPr>
+        <w:t xml:space="preserve"> [4], [8].</w:t>
+      </w:r>
+      <w:r>
+        <w:rPr>
+          <w:sz w:val="21"/>
+          <w:szCs w:val="21"/>
+        </w:rPr>
+        <w:t xml:space="preserve"> </w:t>
+      </w:r>
+      <w:r>
+        <w:rPr>
+          <w:rFonts w:hint="eastAsia"/>
+          <w:sz w:val="21"/>
+          <w:szCs w:val="21"/>
+        </w:rPr>
+        <w:t>Therefore, w</w:t>
+      </w:r>
+      <w:r>
+        <w:rPr>
+          <w:sz w:val="21"/>
+          <w:szCs w:val="21"/>
+        </w:rPr>
+        <w:t>e compare Y and N on their native tasks and additionally evaluate Y as a next-interaction ranker using its preference scores.</w:t>
+      </w:r>
+    </w:p>
+    <w:p>
+      <w:pPr>
+        <w:rPr>
+          <w:sz w:val="21"/>
+          <w:szCs w:val="21"/>
+        </w:rPr>
+      </w:pPr>
+      <w:r>
+        <w:rPr>
+          <w:sz w:val="21"/>
+          <w:szCs w:val="21"/>
+        </w:rPr>
+        <w:t>A single checkpoint captures only one point in training.</w:t>
+      </w:r>
+      <w:r>
+        <w:t xml:space="preserve"> </w:t>
+      </w:r>
+      <w:r>
+        <w:rPr>
+          <w:sz w:val="21"/>
+          <w:szCs w:val="21"/>
+        </w:rPr>
+        <w:t>The relative performance of the models trained with Y and N may change as training progresses</w:t>
+      </w:r>
+      <w:r>
+        <w:rPr>
+          <w:rFonts w:hint="eastAsia"/>
+          <w:sz w:val="21"/>
+          <w:szCs w:val="21"/>
+        </w:rPr>
+        <w:t>.</w:t>
+      </w:r>
+      <w:r>
+        <w:rPr>
+          <w:sz w:val="21"/>
+          <w:szCs w:val="21"/>
+        </w:rPr>
+        <w:t xml:space="preserve"> </w:t>
+      </w:r>
+      <w:r>
+        <w:rPr>
+          <w:sz w:val="21"/>
+          <w:szCs w:val="21"/>
+        </w:rPr>
+        <w:t>We track cumulative task-sample exposure, defined as the number of training examples consumed for each task, including repeated examples, so that checkpoints can be compared by per-task exposure rather than training steps alone.</w:t>
+      </w:r>
+    </w:p>
+    <w:p>
+      <w:pPr>
+        <w:rPr>
+          <w:sz w:val="21"/>
+          <w:szCs w:val="21"/>
+        </w:rPr>
+      </w:pPr>
+      <w:r>
+        <w:rPr>
+          <w:sz w:val="21"/>
+          <w:szCs w:val="21"/>
+        </w:rPr>
+        <w:t xml:space="preserve">We study three tuning settings built on the same Llama-3.2-3B-Instruct backbone: rating-derived preference prediction (Y), next-interaction prediction (N), and a shared Y+N multitask adapter (M1). </w:t>
+      </w:r>
+      <w:r>
+        <w:rPr>
+          <w:sz w:val="21"/>
+          <w:szCs w:val="21"/>
+        </w:rPr>
+        <w:t>Y and N serve as task-specific models, while M1 allows us to compare shared and task-specific training at matched per-task exposure.</w:t>
+      </w:r>
+      <w:r>
+        <w:rPr>
+          <w:sz w:val="21"/>
+          <w:szCs w:val="21"/>
+        </w:rPr>
+        <w:t xml:space="preserve"> For the ranking side, </w:t>
+      </w:r>
+      <w:r>
+        <w:rPr>
+          <w:rFonts w:hint="eastAsia"/>
+          <w:sz w:val="21"/>
+          <w:szCs w:val="21"/>
+        </w:rPr>
+        <w:t>w</w:t>
+      </w:r>
+      <w:r>
+        <w:rPr>
+          <w:sz w:val="21"/>
+          <w:szCs w:val="21"/>
+        </w:rPr>
+        <w:t xml:space="preserve">e also evaluate N and M1-N under alternative candidate protocols to see whether their </w:t>
+      </w:r>
+      <w:r>
+        <w:rPr>
+          <w:rFonts w:hint="eastAsia"/>
+          <w:sz w:val="21"/>
+          <w:szCs w:val="21"/>
+        </w:rPr>
+        <w:t>performance</w:t>
+      </w:r>
+      <w:r>
+        <w:rPr>
+          <w:sz w:val="21"/>
+          <w:szCs w:val="21"/>
+        </w:rPr>
+        <w:t xml:space="preserve"> depends on the evaluation setup</w:t>
+      </w:r>
+      <w:r>
+        <w:rPr>
+          <w:sz w:val="21"/>
+          <w:szCs w:val="21"/>
+        </w:rPr>
+        <w:t xml:space="preserve">. </w:t>
+      </w:r>
+      <w:r>
+        <w:rPr>
+          <w:rFonts w:hint="eastAsia"/>
+          <w:sz w:val="21"/>
+          <w:szCs w:val="21"/>
+        </w:rPr>
+        <w:t>Finally, w</w:t>
+      </w:r>
+      <w:r>
+        <w:rPr>
+          <w:sz w:val="21"/>
+          <w:szCs w:val="21"/>
+        </w:rPr>
+        <w:t xml:space="preserve">e compare </w:t>
+      </w:r>
+      <w:r>
+        <w:rPr>
+          <w:sz w:val="21"/>
+          <w:szCs w:val="21"/>
+        </w:rPr>
+        <w:t>the N-trained Llama-3.2-3B-Instruct model</w:t>
+      </w:r>
+      <w:r>
+        <w:rPr>
+          <w:sz w:val="21"/>
+          <w:szCs w:val="21"/>
+        </w:rPr>
+        <w:t xml:space="preserve"> with </w:t>
+      </w:r>
+      <w:proofErr w:type="spellStart"/>
+      <w:r>
+        <w:rPr>
+          <w:sz w:val="21"/>
+          <w:szCs w:val="21"/>
+        </w:rPr>
         <w:t>SASRec</w:t>
       </w:r>
       <w:proofErr w:type="spellEnd"/>
       <w:r>
-        <w:t xml:space="preserve"> receives more training. The available earlier operating point on Amazon shows the same ranking direction.</w:t>
+        <w:rPr>
+          <w:sz w:val="21"/>
+          <w:szCs w:val="21"/>
+        </w:rPr>
+        <w:t xml:space="preserve"> at matched exposure levels as a conventional sequential-recommendation reference.</w:t>
+      </w:r>
+      <w:r>
+        <w:rPr>
+          <w:sz w:val="21"/>
+          <w:szCs w:val="21"/>
+        </w:rPr>
+        <w:t xml:space="preserve"> </w:t>
       </w:r>
     </w:p>
     <w:p>
       <w:pPr>
         <w:rPr>
-          <w:b/>
-          <w:bCs/>
+          <w:sz w:val="21"/>
+          <w:szCs w:val="21"/>
         </w:rPr>
       </w:pPr>
       <w:r>
         <w:rPr>
-          <w:b/>
-          <w:bCs/>
-        </w:rPr>
-        <w:t>I. INTRODUCTION</w:t>
+          <w:sz w:val="21"/>
+          <w:szCs w:val="21"/>
+        </w:rPr>
+        <w:t>We find that Y performs well on its native preference task but transfers poorly to next-interaction ranking. Across the evaluated exposure range, N ranking performance continues to improve. M1 remains close to the Y specialist on preference prediction, while N retains a small ranking advantage over M1-N.</w:t>
+      </w:r>
+      <w:r>
+        <w:rPr>
+          <w:sz w:val="21"/>
+          <w:szCs w:val="21"/>
+        </w:rPr>
+        <w:t xml:space="preserve"> </w:t>
+      </w:r>
+      <w:r>
+        <w:rPr>
+          <w:sz w:val="21"/>
+          <w:szCs w:val="21"/>
+        </w:rPr>
+        <w:t>The size of the N–M1 ranking gap also varies across candidate protocols.</w:t>
+      </w:r>
+      <w:r>
+        <w:rPr>
+          <w:rFonts w:hint="eastAsia"/>
+          <w:sz w:val="21"/>
+          <w:szCs w:val="21"/>
+        </w:rPr>
+        <w:t xml:space="preserve"> </w:t>
+      </w:r>
+      <w:r>
+        <w:rPr>
+          <w:sz w:val="21"/>
+          <w:szCs w:val="21"/>
+        </w:rPr>
+        <w:t xml:space="preserve">The N-trained LLM leads the evaluated </w:t>
+      </w:r>
+      <w:proofErr w:type="spellStart"/>
+      <w:r>
+        <w:rPr>
+          <w:sz w:val="21"/>
+          <w:szCs w:val="21"/>
+        </w:rPr>
+        <w:t>SASRec</w:t>
+      </w:r>
+      <w:proofErr w:type="spellEnd"/>
+      <w:r>
+        <w:rPr>
+          <w:sz w:val="21"/>
+          <w:szCs w:val="21"/>
+        </w:rPr>
+        <w:t xml:space="preserve"> baseline at the matched exposure points, while the difference is smaller at the largest exposure.</w:t>
+      </w:r>
+      <w:r>
+        <w:rPr>
+          <w:b/>
+          <w:bCs/>
+          <w:sz w:val="21"/>
+          <w:szCs w:val="21"/>
+        </w:rPr>
+        <w:t xml:space="preserve"> </w:t>
       </w:r>
     </w:p>
     <w:p>
       <w:pPr>
         <w:rPr>
-          <w:sz w:val="21"/>
-          <w:szCs w:val="21"/>
+          <w:b/>
+          <w:bCs/>
         </w:rPr>
       </w:pPr>
       <w:r>
         <w:rPr>
-          <w:sz w:val="21"/>
-          <w:szCs w:val="21"/>
-        </w:rPr>
-        <w:t>Large language models (LLMs) have been applied to recommendation in increasingly diverse ways, including conversational recommendation, candidate ranking, and recommendation-specific fine-tuning [1]</w:t>
+          <w:b/>
+          <w:bCs/>
+        </w:rPr>
+        <w:t>II. RELATED WORK</w:t>
+      </w:r>
+    </w:p>
+    <w:p>
+      <w:pPr>
+        <w:rPr>
+          <w:b/>
+          <w:bCs/>
+          <w:sz w:val="21"/>
+          <w:szCs w:val="21"/>
+        </w:rPr>
+      </w:pPr>
+      <w:r>
+        <w:rPr>
+          <w:b/>
+          <w:bCs/>
+          <w:sz w:val="21"/>
+          <w:szCs w:val="21"/>
+        </w:rPr>
+        <w:t>A. LLMs for Recommendation</w:t>
+      </w:r>
+    </w:p>
+    <w:p>
+      <w:pPr>
+        <w:rPr>
+          <w:sz w:val="21"/>
+          <w:szCs w:val="21"/>
+        </w:rPr>
+      </w:pPr>
+      <w:r>
+        <w:rPr>
+          <w:sz w:val="21"/>
+          <w:szCs w:val="21"/>
+        </w:rPr>
+        <w:t xml:space="preserve">Large language models have been incorporated into recommender systems through several distinct paradigms. Early work explored LLMs as zero-shot conversational recommenders and zero-shot rankers, using their pretrained language knowledge without recommendation-specific parameter updates [1], [2]. </w:t>
+      </w:r>
+      <w:r>
+        <w:rPr>
+          <w:sz w:val="21"/>
+          <w:szCs w:val="21"/>
+        </w:rPr>
+        <w:t>Another line of work adapts LLMs directly to recommendation data.</w:t>
+      </w:r>
+      <w:r>
+        <w:rPr>
+          <w:rFonts w:hint="eastAsia"/>
+          <w:sz w:val="21"/>
+          <w:szCs w:val="21"/>
+        </w:rPr>
+        <w:t xml:space="preserve"> </w:t>
+      </w:r>
+      <w:r>
+        <w:rPr>
+          <w:sz w:val="21"/>
+          <w:szCs w:val="21"/>
+        </w:rPr>
+        <w:t>Recommendation</w:t>
+      </w:r>
+      <w:r>
+        <w:rPr>
+          <w:rFonts w:hint="eastAsia"/>
+          <w:sz w:val="21"/>
+          <w:szCs w:val="21"/>
+        </w:rPr>
+        <w:t>-</w:t>
+      </w:r>
+      <w:r>
+        <w:rPr>
+          <w:sz w:val="21"/>
+          <w:szCs w:val="21"/>
+        </w:rPr>
+        <w:t>specific instruction tuning has been applied both to individual recommendation tasks and to broader sets of pointwise, pairwise, matching, and reranking requests</w:t>
+      </w:r>
+      <w:r>
+        <w:rPr>
+          <w:sz w:val="21"/>
+          <w:szCs w:val="21"/>
+        </w:rPr>
+        <w:t xml:space="preserve"> [3], [14]. </w:t>
+      </w:r>
+      <w:r>
+        <w:rPr>
+          <w:sz w:val="21"/>
+          <w:szCs w:val="21"/>
+        </w:rPr>
+        <w:t>These approaches allow recommendation tasks with different prediction interfaces to share the same LLM backbone</w:t>
+      </w:r>
+      <w:r>
+        <w:rPr>
+          <w:sz w:val="21"/>
+          <w:szCs w:val="21"/>
+        </w:rPr>
+        <w:t xml:space="preserve"> [5]. </w:t>
+      </w:r>
+      <w:r>
+        <w:rPr>
+          <w:sz w:val="21"/>
+          <w:szCs w:val="21"/>
+        </w:rPr>
+        <w:t>Our study focuses on this adaptation setting and compares models trained with different recommendation objectives.</w:t>
+      </w:r>
+    </w:p>
+    <w:p>
+      <w:pPr>
+        <w:rPr>
+          <w:b/>
+          <w:bCs/>
+          <w:sz w:val="21"/>
+          <w:szCs w:val="21"/>
+        </w:rPr>
+      </w:pPr>
+      <w:r>
+        <w:rPr>
+          <w:b/>
+          <w:bCs/>
+          <w:sz w:val="21"/>
+          <w:szCs w:val="21"/>
+        </w:rPr>
+        <w:t>B. Recommendation Supervision and Task Formulation</w:t>
+      </w:r>
+    </w:p>
+    <w:p>
+      <w:pPr>
+        <w:rPr>
+          <w:sz w:val="21"/>
+          <w:szCs w:val="21"/>
+        </w:rPr>
+      </w:pPr>
+      <w:r>
+        <w:rPr>
+          <w:sz w:val="21"/>
+          <w:szCs w:val="21"/>
+        </w:rPr>
+        <w:lastRenderedPageBreak/>
+        <w:t xml:space="preserve">Different recommendation tasks are built on different prediction targets. </w:t>
+      </w:r>
+      <w:r>
+        <w:rPr>
+          <w:sz w:val="21"/>
+          <w:szCs w:val="21"/>
+        </w:rPr>
+        <w:t>Rating-based and implicit-feedback methods derive preference signals from different forms of feedback, whereas sequential recommenders focus on predicting future interactions from an ordered history</w:t>
+      </w:r>
+      <w:r>
+        <w:rPr>
+          <w:sz w:val="21"/>
+          <w:szCs w:val="21"/>
+        </w:rPr>
+        <w:t xml:space="preserve"> [6], [7], [15]. These distinctions remain relevant when recommendation is formulated as language modeling. </w:t>
+      </w:r>
+      <w:r>
+        <w:rPr>
+          <w:sz w:val="21"/>
+          <w:szCs w:val="21"/>
+        </w:rPr>
+        <w:t>Unified language-based frameworks can place rating-related, next-item, and other recommendation objectives within similar text-based interfaces</w:t>
+      </w:r>
+      <w:r>
+        <w:rPr>
+          <w:sz w:val="21"/>
+          <w:szCs w:val="21"/>
+        </w:rPr>
+        <w:t xml:space="preserve"> [4], [8].</w:t>
+      </w:r>
+    </w:p>
+    <w:p>
+      <w:pPr>
+        <w:rPr>
+          <w:sz w:val="21"/>
+          <w:szCs w:val="21"/>
+        </w:rPr>
+      </w:pPr>
+      <w:r>
+        <w:rPr>
+          <w:sz w:val="21"/>
+          <w:szCs w:val="21"/>
+        </w:rPr>
+        <w:t>This distinction motivates our Y and N settings, which</w:t>
+      </w:r>
+      <w:r>
+        <w:rPr>
+          <w:rFonts w:hint="eastAsia"/>
+          <w:sz w:val="21"/>
+          <w:szCs w:val="21"/>
+        </w:rPr>
+        <w:t xml:space="preserve"> </w:t>
+      </w:r>
+      <w:r>
+        <w:rPr>
+          <w:sz w:val="21"/>
+          <w:szCs w:val="21"/>
+        </w:rPr>
+        <w:t>respectively use rating-derived preference and next-interaction supervision.</w:t>
+      </w:r>
+      <w:r>
+        <w:rPr>
+          <w:sz w:val="21"/>
+          <w:szCs w:val="21"/>
+        </w:rPr>
+        <w:t xml:space="preserve"> We evaluate each task through its native interface and additionally use Y scores to rank next-interaction candidates. </w:t>
+      </w:r>
+      <w:r>
+        <w:rPr>
+          <w:sz w:val="21"/>
+          <w:szCs w:val="21"/>
+        </w:rPr>
+        <w:t>The Y-as-ranker evaluation provides a direct check of whether preference-oriented supervision carries over to next-interaction ranking.</w:t>
+      </w:r>
+    </w:p>
+    <w:p>
+      <w:pPr>
+        <w:rPr>
+          <w:b/>
+          <w:bCs/>
+          <w:sz w:val="21"/>
+          <w:szCs w:val="21"/>
+        </w:rPr>
+      </w:pPr>
+      <w:r>
+        <w:rPr>
+          <w:b/>
+          <w:bCs/>
+          <w:sz w:val="21"/>
+          <w:szCs w:val="21"/>
+        </w:rPr>
+        <w:t>C. Multitask and Unified Recommendation Modeling</w:t>
+      </w:r>
+    </w:p>
+    <w:p>
+      <w:pPr>
+        <w:rPr>
+          <w:sz w:val="21"/>
+          <w:szCs w:val="21"/>
+        </w:rPr>
+      </w:pPr>
+      <w:r>
+        <w:rPr>
+          <w:sz w:val="21"/>
+          <w:szCs w:val="21"/>
+        </w:rPr>
+        <w:t xml:space="preserve">A separate line of work studies whether multiple recommendation tasks or domains can be learned within a shared model. </w:t>
+      </w:r>
+      <w:r>
+        <w:rPr>
+          <w:sz w:val="21"/>
+          <w:szCs w:val="21"/>
+        </w:rPr>
+        <w:t>Recent work on unified recommendation has examined how task sharing interacts with training-data allocation, task sampling, and specialization across domains or objectives [12], [13], [16].</w:t>
+      </w:r>
+      <w:r>
+        <w:t xml:space="preserve"> </w:t>
+      </w:r>
+      <w:r>
+        <w:rPr>
+          <w:sz w:val="21"/>
+          <w:szCs w:val="21"/>
+        </w:rPr>
+        <w:t>In particular, the benefit of sharing has been shown to depend on the amount and composition of auxiliary training data [13].</w:t>
+      </w:r>
+      <w:r>
+        <w:rPr>
+          <w:sz w:val="21"/>
+          <w:szCs w:val="21"/>
+        </w:rPr>
+        <w:t xml:space="preserve"> </w:t>
+      </w:r>
+      <w:r>
+        <w:rPr>
+          <w:sz w:val="21"/>
+          <w:szCs w:val="21"/>
+        </w:rPr>
+        <w:t>This makes training-data allocation an important part of evaluating shared models.</w:t>
+      </w:r>
+    </w:p>
+    <w:p>
+      <w:pPr>
+        <w:rPr>
+          <w:sz w:val="21"/>
+          <w:szCs w:val="21"/>
+        </w:rPr>
+      </w:pPr>
+      <w:r>
+        <w:rPr>
+          <w:sz w:val="21"/>
+          <w:szCs w:val="21"/>
+        </w:rPr>
+        <w:t xml:space="preserve">Our study examines a narrower version of this problem. We compare Y and N specialists with a shared Y+N adapter and explicitly match the cumulative supervision received by the corresponding task. </w:t>
+      </w:r>
+      <w:r>
+        <w:rPr>
+          <w:sz w:val="21"/>
+          <w:szCs w:val="21"/>
+        </w:rPr>
+        <w:t>Rather than comparing multitask and task-specific models at only one checkpoint, we compare them at matched per-task exposure points.</w:t>
+      </w:r>
+    </w:p>
+    <w:p>
+      <w:pPr>
+        <w:rPr>
+          <w:b/>
+          <w:bCs/>
+          <w:sz w:val="21"/>
+          <w:szCs w:val="21"/>
+        </w:rPr>
+      </w:pPr>
+      <w:r>
+        <w:rPr>
+          <w:b/>
+          <w:bCs/>
+          <w:sz w:val="21"/>
+          <w:szCs w:val="21"/>
+        </w:rPr>
+        <w:t>D. Offline Evaluation and Sequential Baselines</w:t>
+      </w:r>
+    </w:p>
+    <w:p>
+      <w:pPr>
+        <w:rPr>
+          <w:sz w:val="21"/>
+          <w:szCs w:val="21"/>
+        </w:rPr>
+      </w:pPr>
+      <w:r>
+        <w:rPr>
+          <w:sz w:val="21"/>
+          <w:szCs w:val="21"/>
+        </w:rPr>
+        <w:t>Offline ranking results are sensitive to the construction of the evaluation set. Sampled metrics may not preserve the ordering obtained from full-catalog evaluation, and different negative- or target-sampling strategies can change measured performance and model rankings [9]</w:t>
       </w:r>
       <w:proofErr w:type="gramStart"/>
       <w:r>
@@ -265,37 +956,7 @@
           <w:sz w:val="21"/>
           <w:szCs w:val="21"/>
         </w:rPr>
-        <w:t>4]. A major appeal of this line of work is that different recommendation tasks can be expressed through a common language-model interface. However, a shared interface does not imply a shared prediction objective. Models trained through similar prompts may still receive different supervision and</w:t>
-      </w:r>
-      <w:r>
-        <w:rPr>
-          <w:rFonts w:hint="eastAsia"/>
-          <w:sz w:val="21"/>
-          <w:szCs w:val="21"/>
-        </w:rPr>
-        <w:t xml:space="preserve"> </w:t>
-      </w:r>
-      <w:r>
-        <w:rPr>
-          <w:sz w:val="21"/>
-          <w:szCs w:val="21"/>
-        </w:rPr>
-        <w:t>exhibit dif</w:t>
-      </w:r>
-      <w:r>
-        <w:rPr>
-          <w:rFonts w:hint="eastAsia"/>
-          <w:sz w:val="21"/>
-          <w:szCs w:val="21"/>
-        </w:rPr>
-        <w:t>ferent</w:t>
-      </w:r>
-      <w:r>
-        <w:rPr>
-          <w:sz w:val="21"/>
-          <w:szCs w:val="21"/>
-        </w:rPr>
-        <w:t xml:space="preserve"> behavior.</w:t>
+        <w:t>11]. We therefore evaluate the N–M1 comparison under several separately constructed candidate protocols. Because these protocols differ simultaneously in candidate count, sampling, and composition, we use them to test the stability of the observed model relationship rather than to infer an isolated candidate-size effect.</w:t>
       </w:r>
     </w:p>
     <w:p>
@@ -310,80 +971,44 @@
           <w:sz w:val="21"/>
           <w:szCs w:val="21"/>
         </w:rPr>
-        <w:t>Preference prediction and next-interaction prediction provide a representative example. Preference prediction asks whether a user is likely to favor an item, wh</w:t>
-      </w:r>
-      <w:r>
-        <w:rPr>
-          <w:rFonts w:hint="eastAsia"/>
-          <w:sz w:val="21"/>
-          <w:szCs w:val="21"/>
-        </w:rPr>
-        <w:t>ile</w:t>
-      </w:r>
-      <w:r>
-        <w:rPr>
-          <w:sz w:val="21"/>
-          <w:szCs w:val="21"/>
-        </w:rPr>
-        <w:t xml:space="preserve"> next-interaction prediction asks which item will appear next in the observed behavior sequence. </w:t>
-      </w:r>
-      <w:r>
-        <w:rPr>
-          <w:sz w:val="21"/>
-          <w:szCs w:val="21"/>
-        </w:rPr>
-        <w:t>These objectives have long been distinguished in</w:t>
-      </w:r>
-      <w:r>
-        <w:rPr>
-          <w:rFonts w:hint="eastAsia"/>
-          <w:sz w:val="21"/>
-          <w:szCs w:val="21"/>
-        </w:rPr>
-        <w:t xml:space="preserve"> conventional</w:t>
-      </w:r>
-      <w:r>
-        <w:rPr>
-          <w:sz w:val="21"/>
-          <w:szCs w:val="21"/>
-        </w:rPr>
-        <w:t xml:space="preserve"> recommender systems [6], [7], </w:t>
-      </w:r>
-      <w:r>
-        <w:rPr>
-          <w:sz w:val="21"/>
-          <w:szCs w:val="21"/>
-        </w:rPr>
-        <w:t>but recent language-based frameworks can formulate both through similar text-based prediction interfaces</w:t>
-      </w:r>
-      <w:r>
-        <w:rPr>
-          <w:sz w:val="21"/>
-          <w:szCs w:val="21"/>
-        </w:rPr>
-        <w:t xml:space="preserve"> [4], [8].</w:t>
-      </w:r>
-      <w:r>
-        <w:rPr>
-          <w:sz w:val="21"/>
-          <w:szCs w:val="21"/>
-        </w:rPr>
-        <w:t xml:space="preserve"> </w:t>
-      </w:r>
-      <w:r>
-        <w:rPr>
-          <w:rFonts w:hint="eastAsia"/>
-          <w:sz w:val="21"/>
-          <w:szCs w:val="21"/>
-        </w:rPr>
-        <w:t>Therefore, w</w:t>
-      </w:r>
-      <w:r>
-        <w:rPr>
-          <w:sz w:val="21"/>
-          <w:szCs w:val="21"/>
-        </w:rPr>
-        <w:t xml:space="preserve">e compare Y and N on their native tasks and additionally evaluate Y as a next-interaction ranker </w:t>
+        <w:t>A conventional sequential baseline provides a further point of comparison</w:t>
+      </w:r>
+      <w:r>
+        <w:rPr>
+          <w:sz w:val="21"/>
+          <w:szCs w:val="21"/>
+        </w:rPr>
+        <w:t xml:space="preserve">. </w:t>
+      </w:r>
+      <w:proofErr w:type="spellStart"/>
+      <w:r>
+        <w:rPr>
+          <w:sz w:val="21"/>
+          <w:szCs w:val="21"/>
+        </w:rPr>
+        <w:t>SASRec</w:t>
+      </w:r>
+      <w:proofErr w:type="spellEnd"/>
+      <w:r>
+        <w:rPr>
+          <w:sz w:val="21"/>
+          <w:szCs w:val="21"/>
+        </w:rPr>
+        <w:t xml:space="preserve"> remains a standard sequential recommender [7]. More broadly, reproducibility studies show that baseline performance can depend strongly on training and evaluation choices [17], [18].</w:t>
+      </w:r>
+      <w:r>
+        <w:rPr>
+          <w:sz w:val="21"/>
+          <w:szCs w:val="21"/>
+        </w:rPr>
+        <w:t xml:space="preserve"> </w:t>
+      </w:r>
+      <w:r>
+        <w:rPr>
+          <w:sz w:val="21"/>
+          <w:szCs w:val="21"/>
+        </w:rPr>
+        <w:t xml:space="preserve">Sequential recommender performance can also continue to change as training data increase [19], making the </w:t>
       </w:r>
       <w:r>
         <w:rPr>
@@ -391,142 +1016,29 @@
           <w:szCs w:val="21"/>
         </w:rPr>
         <w:lastRenderedPageBreak/>
-        <w:t>using its preference scores.</w:t>
-      </w:r>
-    </w:p>
-    <w:p>
-      <w:pPr>
-        <w:rPr>
-          <w:sz w:val="21"/>
-          <w:szCs w:val="21"/>
-        </w:rPr>
-      </w:pPr>
-      <w:r>
-        <w:rPr>
-          <w:sz w:val="21"/>
-          <w:szCs w:val="21"/>
-        </w:rPr>
-        <w:t>A single checkpoint captures only one point in training.</w:t>
-      </w:r>
-      <w:r>
-        <w:t xml:space="preserve"> </w:t>
-      </w:r>
-      <w:r>
-        <w:rPr>
-          <w:sz w:val="21"/>
-          <w:szCs w:val="21"/>
-        </w:rPr>
-        <w:t>The relative performance of the models trained with Y and N may change as training progresses</w:t>
-      </w:r>
-      <w:r>
-        <w:rPr>
-          <w:rFonts w:hint="eastAsia"/>
-          <w:sz w:val="21"/>
-          <w:szCs w:val="21"/>
-        </w:rPr>
-        <w:t>.</w:t>
-      </w:r>
-      <w:r>
-        <w:rPr>
-          <w:sz w:val="21"/>
-          <w:szCs w:val="21"/>
-        </w:rPr>
-        <w:t xml:space="preserve"> </w:t>
-      </w:r>
-      <w:r>
-        <w:rPr>
-          <w:sz w:val="21"/>
-          <w:szCs w:val="21"/>
-        </w:rPr>
-        <w:t>We track cumulative task-sample exposure, defined as the number of training examples consumed for each task, including repeated examples, so that checkpoints can be compared by per-task exposure rather than training steps alone.</w:t>
-      </w:r>
-    </w:p>
-    <w:p>
-      <w:pPr>
-        <w:rPr>
-          <w:sz w:val="21"/>
-          <w:szCs w:val="21"/>
-        </w:rPr>
-      </w:pPr>
-      <w:r>
-        <w:rPr>
-          <w:sz w:val="21"/>
-          <w:szCs w:val="21"/>
-        </w:rPr>
-        <w:t xml:space="preserve">We study three tuning settings built on the same Llama-3.2-3B-Instruct backbone: rating-derived preference prediction (Y), next-interaction prediction (N), and a shared Y+N multitask adapter (M1). </w:t>
-      </w:r>
-      <w:r>
-        <w:rPr>
-          <w:sz w:val="21"/>
-          <w:szCs w:val="21"/>
-        </w:rPr>
-        <w:t>Y and N serve as task-specific models, while M1 allows us to compare shared and task-specific training at matched per-task exposure.</w:t>
-      </w:r>
-      <w:r>
-        <w:rPr>
-          <w:sz w:val="21"/>
-          <w:szCs w:val="21"/>
-        </w:rPr>
-        <w:t xml:space="preserve"> For the ranking side, </w:t>
-      </w:r>
-      <w:r>
-        <w:rPr>
-          <w:rFonts w:hint="eastAsia"/>
-          <w:sz w:val="21"/>
-          <w:szCs w:val="21"/>
-        </w:rPr>
-        <w:t>w</w:t>
-      </w:r>
-      <w:r>
-        <w:rPr>
-          <w:sz w:val="21"/>
-          <w:szCs w:val="21"/>
-        </w:rPr>
-        <w:t xml:space="preserve">e also evaluate N and M1-N under alternative candidate protocols to see whether their </w:t>
-      </w:r>
-      <w:r>
-        <w:rPr>
-          <w:rFonts w:hint="eastAsia"/>
-          <w:sz w:val="21"/>
-          <w:szCs w:val="21"/>
-        </w:rPr>
-        <w:t>performance</w:t>
-      </w:r>
-      <w:r>
-        <w:rPr>
-          <w:sz w:val="21"/>
-          <w:szCs w:val="21"/>
-        </w:rPr>
-        <w:t xml:space="preserve"> depends on the evaluation setup</w:t>
-      </w:r>
-      <w:r>
-        <w:rPr>
-          <w:sz w:val="21"/>
-          <w:szCs w:val="21"/>
-        </w:rPr>
-        <w:t xml:space="preserve">. </w:t>
-      </w:r>
-      <w:r>
-        <w:rPr>
-          <w:rFonts w:hint="eastAsia"/>
-          <w:sz w:val="21"/>
-          <w:szCs w:val="21"/>
-        </w:rPr>
-        <w:t>Finally, w</w:t>
-      </w:r>
-      <w:r>
-        <w:rPr>
-          <w:sz w:val="21"/>
-          <w:szCs w:val="21"/>
-        </w:rPr>
-        <w:t xml:space="preserve">e compare </w:t>
-      </w:r>
-      <w:r>
-        <w:rPr>
-          <w:sz w:val="21"/>
-          <w:szCs w:val="21"/>
-        </w:rPr>
-        <w:t>the N-trained Llama-3.2-3B-Instruct model</w:t>
+        <w:t>comparison sensitive to the chosen training point.</w:t>
+      </w:r>
+      <w:r>
+        <w:rPr>
+          <w:sz w:val="21"/>
+          <w:szCs w:val="21"/>
+        </w:rPr>
+        <w:t xml:space="preserve"> </w:t>
+      </w:r>
+      <w:r>
+        <w:rPr>
+          <w:sz w:val="21"/>
+          <w:szCs w:val="21"/>
+        </w:rPr>
+        <w:t>We therefore compare the N-trained</w:t>
+      </w:r>
+      <w:r>
+        <w:rPr>
+          <w:rFonts w:hint="eastAsia"/>
+          <w:sz w:val="21"/>
+          <w:szCs w:val="21"/>
+        </w:rPr>
+        <w:t xml:space="preserve"> LLM</w:t>
       </w:r>
       <w:r>
         <w:rPr>
@@ -541,608 +1053,6 @@
           <w:sz w:val="21"/>
           <w:szCs w:val="21"/>
         </w:rPr>
-        <w:t>SASRec</w:t>
-      </w:r>
-      <w:proofErr w:type="spellEnd"/>
-      <w:r>
-        <w:rPr>
-          <w:sz w:val="21"/>
-          <w:szCs w:val="21"/>
-        </w:rPr>
-        <w:t xml:space="preserve"> at matched exposure levels as a conventional sequential-recommendation reference.</w:t>
-      </w:r>
-      <w:r>
-        <w:rPr>
-          <w:sz w:val="21"/>
-          <w:szCs w:val="21"/>
-        </w:rPr>
-        <w:t xml:space="preserve"> </w:t>
-      </w:r>
-    </w:p>
-    <w:p>
-      <w:pPr>
-        <w:rPr>
-          <w:sz w:val="21"/>
-          <w:szCs w:val="21"/>
-        </w:rPr>
-      </w:pPr>
-      <w:r>
-        <w:rPr>
-          <w:sz w:val="21"/>
-          <w:szCs w:val="21"/>
-        </w:rPr>
-        <w:t>We find that Y performs well on its native preference task but transfers poorly to next-interaction ranking. Across the evaluated exposure range, N ranking performance continues to improve.</w:t>
-      </w:r>
-      <w:r>
-        <w:rPr>
-          <w:sz w:val="21"/>
-          <w:szCs w:val="21"/>
-        </w:rPr>
-        <w:t xml:space="preserve"> </w:t>
-      </w:r>
-      <w:r>
-        <w:rPr>
-          <w:sz w:val="21"/>
-          <w:szCs w:val="21"/>
-        </w:rPr>
-        <w:t>M1 remains close to the Y specialist on preference prediction, while N retains a small ranking advantage over M1-N.</w:t>
-      </w:r>
-      <w:r>
-        <w:rPr>
-          <w:sz w:val="21"/>
-          <w:szCs w:val="21"/>
-        </w:rPr>
-        <w:t xml:space="preserve"> </w:t>
-      </w:r>
-      <w:r>
-        <w:rPr>
-          <w:sz w:val="21"/>
-          <w:szCs w:val="21"/>
-        </w:rPr>
-        <w:t>The size of the N–M1 ranking gap also varies across candidate protocols.</w:t>
-      </w:r>
-      <w:r>
-        <w:rPr>
-          <w:rFonts w:hint="eastAsia"/>
-          <w:sz w:val="21"/>
-          <w:szCs w:val="21"/>
-        </w:rPr>
-        <w:t xml:space="preserve"> </w:t>
-      </w:r>
-      <w:proofErr w:type="gramStart"/>
-      <w:r>
-        <w:rPr>
-          <w:rFonts w:hint="eastAsia"/>
-          <w:sz w:val="21"/>
-          <w:szCs w:val="21"/>
-        </w:rPr>
-        <w:t>The</w:t>
-      </w:r>
-      <w:proofErr w:type="gramEnd"/>
-      <w:r>
-        <w:rPr>
-          <w:rFonts w:hint="eastAsia"/>
-          <w:sz w:val="21"/>
-          <w:szCs w:val="21"/>
-        </w:rPr>
-        <w:t xml:space="preserve"> </w:t>
-      </w:r>
-      <w:r>
-        <w:rPr>
-          <w:sz w:val="21"/>
-          <w:szCs w:val="21"/>
-        </w:rPr>
-        <w:t xml:space="preserve">N-trained </w:t>
-      </w:r>
-      <w:r>
-        <w:rPr>
-          <w:rFonts w:hint="eastAsia"/>
-          <w:sz w:val="21"/>
-          <w:szCs w:val="21"/>
-        </w:rPr>
-        <w:t>LLM</w:t>
-      </w:r>
-      <w:r>
-        <w:rPr>
-          <w:sz w:val="21"/>
-          <w:szCs w:val="21"/>
-        </w:rPr>
-        <w:t xml:space="preserve"> leads the evaluated </w:t>
-      </w:r>
-      <w:proofErr w:type="spellStart"/>
-      <w:r>
-        <w:rPr>
-          <w:sz w:val="21"/>
-          <w:szCs w:val="21"/>
-        </w:rPr>
-        <w:t>SASRec</w:t>
-      </w:r>
-      <w:proofErr w:type="spellEnd"/>
-      <w:r>
-        <w:rPr>
-          <w:sz w:val="21"/>
-          <w:szCs w:val="21"/>
-        </w:rPr>
-        <w:t xml:space="preserve"> baseline at the matched exposure points, while the gap narrows as </w:t>
-      </w:r>
-      <w:proofErr w:type="spellStart"/>
-      <w:r>
-        <w:rPr>
-          <w:sz w:val="21"/>
-          <w:szCs w:val="21"/>
-        </w:rPr>
-        <w:t>SASRec</w:t>
-      </w:r>
-      <w:proofErr w:type="spellEnd"/>
-      <w:r>
-        <w:rPr>
-          <w:sz w:val="21"/>
-          <w:szCs w:val="21"/>
-        </w:rPr>
-        <w:t xml:space="preserve"> receives more training.</w:t>
-      </w:r>
-      <w:r>
-        <w:rPr>
-          <w:b/>
-          <w:bCs/>
-          <w:sz w:val="21"/>
-          <w:szCs w:val="21"/>
-        </w:rPr>
-        <w:t xml:space="preserve"> </w:t>
-      </w:r>
-    </w:p>
-    <w:p>
-      <w:pPr>
-        <w:rPr>
-          <w:b/>
-          <w:bCs/>
-        </w:rPr>
-      </w:pPr>
-      <w:r>
-        <w:rPr>
-          <w:b/>
-          <w:bCs/>
-        </w:rPr>
-        <w:t>II. RELATED WORK</w:t>
-      </w:r>
-    </w:p>
-    <w:p>
-      <w:pPr>
-        <w:rPr>
-          <w:b/>
-          <w:bCs/>
-          <w:sz w:val="21"/>
-          <w:szCs w:val="21"/>
-        </w:rPr>
-      </w:pPr>
-      <w:r>
-        <w:rPr>
-          <w:b/>
-          <w:bCs/>
-          <w:sz w:val="21"/>
-          <w:szCs w:val="21"/>
-        </w:rPr>
-        <w:t>A. LLMs for Recommendation</w:t>
-      </w:r>
-    </w:p>
-    <w:p>
-      <w:pPr>
-        <w:rPr>
-          <w:sz w:val="21"/>
-          <w:szCs w:val="21"/>
-        </w:rPr>
-      </w:pPr>
-      <w:r>
-        <w:rPr>
-          <w:sz w:val="21"/>
-          <w:szCs w:val="21"/>
-        </w:rPr>
-        <w:t xml:space="preserve">Large language models have been incorporated into recommender systems through several distinct paradigms. Early work explored LLMs as zero-shot conversational recommenders and zero-shot rankers, using their pretrained language knowledge without recommendation-specific parameter updates [1], [2]. </w:t>
-      </w:r>
-      <w:r>
-        <w:rPr>
-          <w:sz w:val="21"/>
-          <w:szCs w:val="21"/>
-        </w:rPr>
-        <w:t>Another line of work adapts LLMs directly to recommendation data.</w:t>
-      </w:r>
-      <w:r>
-        <w:rPr>
-          <w:rFonts w:hint="eastAsia"/>
-          <w:sz w:val="21"/>
-          <w:szCs w:val="21"/>
-        </w:rPr>
-        <w:t xml:space="preserve"> </w:t>
-      </w:r>
-      <w:r>
-        <w:rPr>
-          <w:sz w:val="21"/>
-          <w:szCs w:val="21"/>
-        </w:rPr>
-        <w:t>Recommendation</w:t>
-      </w:r>
-      <w:r>
-        <w:rPr>
-          <w:rFonts w:hint="eastAsia"/>
-          <w:sz w:val="21"/>
-          <w:szCs w:val="21"/>
-        </w:rPr>
-        <w:t>-</w:t>
-      </w:r>
-      <w:r>
-        <w:rPr>
-          <w:sz w:val="21"/>
-          <w:szCs w:val="21"/>
-        </w:rPr>
-        <w:t>specific instruction tuning has been applied both to individual recommendation tasks and to broader sets of pointwise, pairwise, matching, and reranking requests</w:t>
-      </w:r>
-      <w:r>
-        <w:rPr>
-          <w:sz w:val="21"/>
-          <w:szCs w:val="21"/>
-        </w:rPr>
-        <w:t xml:space="preserve"> [3], [14]. </w:t>
-      </w:r>
-      <w:r>
-        <w:rPr>
-          <w:sz w:val="21"/>
-          <w:szCs w:val="21"/>
-        </w:rPr>
-        <w:t>These approaches allow recommendation tasks with different prediction interfaces to share the same LLM backbone</w:t>
-      </w:r>
-      <w:r>
-        <w:rPr>
-          <w:sz w:val="21"/>
-          <w:szCs w:val="21"/>
-        </w:rPr>
-        <w:t xml:space="preserve"> [5]. </w:t>
-      </w:r>
-      <w:r>
-        <w:rPr>
-          <w:sz w:val="21"/>
-          <w:szCs w:val="21"/>
-        </w:rPr>
-        <w:t>Our study focuses on this adaptation setting and compares models trained with different recommendation objectives.</w:t>
-      </w:r>
-    </w:p>
-    <w:p>
-      <w:pPr>
-        <w:rPr>
-          <w:b/>
-          <w:bCs/>
-          <w:sz w:val="21"/>
-          <w:szCs w:val="21"/>
-        </w:rPr>
-      </w:pPr>
-      <w:r>
-        <w:rPr>
-          <w:b/>
-          <w:bCs/>
-          <w:sz w:val="21"/>
-          <w:szCs w:val="21"/>
-        </w:rPr>
-        <w:t>B. Recommendation Supervision and Task Formulation</w:t>
-      </w:r>
-    </w:p>
-    <w:p>
-      <w:pPr>
-        <w:rPr>
-          <w:sz w:val="21"/>
-          <w:szCs w:val="21"/>
-        </w:rPr>
-      </w:pPr>
-      <w:r>
-        <w:rPr>
-          <w:sz w:val="21"/>
-          <w:szCs w:val="21"/>
-        </w:rPr>
-        <w:t xml:space="preserve">Different recommendation tasks are built on different prediction targets. </w:t>
-      </w:r>
-      <w:r>
-        <w:rPr>
-          <w:sz w:val="21"/>
-          <w:szCs w:val="21"/>
-        </w:rPr>
-        <w:t xml:space="preserve">Rating-based and </w:t>
-      </w:r>
-      <w:r>
-        <w:rPr>
-          <w:sz w:val="21"/>
-          <w:szCs w:val="21"/>
-        </w:rPr>
-        <w:lastRenderedPageBreak/>
-        <w:t>implicit-feedback methods derive preference signals from different forms of feedback, whereas sequential recommenders focus on predicting future interactions from an ordered history</w:t>
-      </w:r>
-      <w:r>
-        <w:rPr>
-          <w:sz w:val="21"/>
-          <w:szCs w:val="21"/>
-        </w:rPr>
-        <w:t xml:space="preserve"> [6], [7], [15]. These distinctions remain relevant when recommendation is formulated as language modeling. </w:t>
-      </w:r>
-      <w:r>
-        <w:rPr>
-          <w:sz w:val="21"/>
-          <w:szCs w:val="21"/>
-        </w:rPr>
-        <w:t>Unified language-based frameworks can place rating-related, next-item, and other recommendation objectives within similar text-based interfaces</w:t>
-      </w:r>
-      <w:r>
-        <w:rPr>
-          <w:sz w:val="21"/>
-          <w:szCs w:val="21"/>
-        </w:rPr>
-        <w:t xml:space="preserve"> [4], [8].</w:t>
-      </w:r>
-    </w:p>
-    <w:p>
-      <w:pPr>
-        <w:rPr>
-          <w:sz w:val="21"/>
-          <w:szCs w:val="21"/>
-        </w:rPr>
-      </w:pPr>
-      <w:r>
-        <w:rPr>
-          <w:sz w:val="21"/>
-          <w:szCs w:val="21"/>
-        </w:rPr>
-        <w:t>This distinction motivates our Y and N settings, which</w:t>
-      </w:r>
-      <w:r>
-        <w:rPr>
-          <w:rFonts w:hint="eastAsia"/>
-          <w:sz w:val="21"/>
-          <w:szCs w:val="21"/>
-        </w:rPr>
-        <w:t xml:space="preserve"> </w:t>
-      </w:r>
-      <w:r>
-        <w:rPr>
-          <w:sz w:val="21"/>
-          <w:szCs w:val="21"/>
-        </w:rPr>
-        <w:t>respectively use rating-derived preference and next-interaction supervision.</w:t>
-      </w:r>
-      <w:r>
-        <w:rPr>
-          <w:sz w:val="21"/>
-          <w:szCs w:val="21"/>
-        </w:rPr>
-        <w:t xml:space="preserve"> We evaluate each task through its native interface and additionally use Y scores to rank next-interaction candidates. </w:t>
-      </w:r>
-      <w:r>
-        <w:rPr>
-          <w:sz w:val="21"/>
-          <w:szCs w:val="21"/>
-        </w:rPr>
-        <w:t>The Y-as-ranker evaluation provides a direct check of whether preference-oriented supervision carries over to next-interaction ranking.</w:t>
-      </w:r>
-    </w:p>
-    <w:p>
-      <w:pPr>
-        <w:rPr>
-          <w:b/>
-          <w:bCs/>
-          <w:sz w:val="21"/>
-          <w:szCs w:val="21"/>
-        </w:rPr>
-      </w:pPr>
-      <w:r>
-        <w:rPr>
-          <w:b/>
-          <w:bCs/>
-          <w:sz w:val="21"/>
-          <w:szCs w:val="21"/>
-        </w:rPr>
-        <w:t>C. Multitask and Unified Recommendation Modeling</w:t>
-      </w:r>
-    </w:p>
-    <w:p>
-      <w:pPr>
-        <w:rPr>
-          <w:sz w:val="21"/>
-          <w:szCs w:val="21"/>
-        </w:rPr>
-      </w:pPr>
-      <w:r>
-        <w:rPr>
-          <w:sz w:val="21"/>
-          <w:szCs w:val="21"/>
-        </w:rPr>
-        <w:t xml:space="preserve">A separate line of work studies whether multiple recommendation tasks or domains can be learned within a shared model. </w:t>
-      </w:r>
-      <w:r>
-        <w:rPr>
-          <w:sz w:val="21"/>
-          <w:szCs w:val="21"/>
-        </w:rPr>
-        <w:t>Recent work on unified recommendation has examined how task sharing interacts with training-data allocation, task sampling, and specialization across domains or objectives [12], [13], [16].</w:t>
-      </w:r>
-      <w:r>
-        <w:t xml:space="preserve"> </w:t>
-      </w:r>
-      <w:r>
-        <w:rPr>
-          <w:sz w:val="21"/>
-          <w:szCs w:val="21"/>
-        </w:rPr>
-        <w:t>In particular, the benefit of sharing has been shown to depend on the amount and composition of auxiliary training data [13].</w:t>
-      </w:r>
-      <w:r>
-        <w:rPr>
-          <w:sz w:val="21"/>
-          <w:szCs w:val="21"/>
-        </w:rPr>
-        <w:t xml:space="preserve"> </w:t>
-      </w:r>
-      <w:r>
-        <w:rPr>
-          <w:sz w:val="21"/>
-          <w:szCs w:val="21"/>
-        </w:rPr>
-        <w:t>This makes training-data allocation an important part of evaluating shared models.</w:t>
-      </w:r>
-    </w:p>
-    <w:p>
-      <w:pPr>
-        <w:rPr>
-          <w:sz w:val="21"/>
-          <w:szCs w:val="21"/>
-        </w:rPr>
-      </w:pPr>
-      <w:r>
-        <w:rPr>
-          <w:sz w:val="21"/>
-          <w:szCs w:val="21"/>
-        </w:rPr>
-        <w:t xml:space="preserve">Our study examines a narrower version of this problem. We compare Y and N specialists with a shared Y+N adapter and explicitly match the cumulative supervision received by the corresponding task. </w:t>
-      </w:r>
-      <w:r>
-        <w:rPr>
-          <w:sz w:val="21"/>
-          <w:szCs w:val="21"/>
-        </w:rPr>
-        <w:t>Rather than comparing multitask and task-specific models at only one checkpoint, we compare them at matched per-task exposure points.</w:t>
-      </w:r>
-    </w:p>
-    <w:p>
-      <w:pPr>
-        <w:rPr>
-          <w:b/>
-          <w:bCs/>
-          <w:sz w:val="21"/>
-          <w:szCs w:val="21"/>
-        </w:rPr>
-      </w:pPr>
-      <w:r>
-        <w:rPr>
-          <w:b/>
-          <w:bCs/>
-          <w:sz w:val="21"/>
-          <w:szCs w:val="21"/>
-        </w:rPr>
-        <w:t>D. Offline Evaluation and Sequential Baselines</w:t>
-      </w:r>
-    </w:p>
-    <w:p>
-      <w:pPr>
-        <w:rPr>
-          <w:sz w:val="21"/>
-          <w:szCs w:val="21"/>
-        </w:rPr>
-      </w:pPr>
-      <w:r>
-        <w:rPr>
-          <w:sz w:val="21"/>
-          <w:szCs w:val="21"/>
-        </w:rPr>
-        <w:t>Offline ranking results are sensitive to the construction of the evaluation set. Sampled metrics may not preserve the ordering obtained from full-catalog evaluation, and different negative- or target-sampling strategies can change measured performance and model rankings [9]</w:t>
-      </w:r>
-      <w:proofErr w:type="gramStart"/>
-      <w:r>
-        <w:rPr>
-          <w:sz w:val="21"/>
-          <w:szCs w:val="21"/>
-        </w:rPr>
-        <w:t>–[</w:t>
-      </w:r>
-      <w:proofErr w:type="gramEnd"/>
-      <w:r>
-        <w:rPr>
-          <w:sz w:val="21"/>
-          <w:szCs w:val="21"/>
-        </w:rPr>
-        <w:t>11]. We therefore evaluate the N–M1 comparison under several separately constructed candidate protocols. Because these protocols differ simultaneously in candidate count, sampling, and composition, we use them to test the stability of the observed model relationship rather than to infer an isolated candidate-size effect.</w:t>
-      </w:r>
-    </w:p>
-    <w:p>
-      <w:pPr>
-        <w:rPr>
-          <w:sz w:val="21"/>
-          <w:szCs w:val="21"/>
-        </w:rPr>
-      </w:pPr>
-      <w:r>
-        <w:rPr>
-          <w:sz w:val="21"/>
-          <w:szCs w:val="21"/>
-        </w:rPr>
-        <w:t>A conventional sequential baseline provides a further point of comparison</w:t>
-      </w:r>
-      <w:r>
-        <w:rPr>
-          <w:sz w:val="21"/>
-          <w:szCs w:val="21"/>
-        </w:rPr>
-        <w:t xml:space="preserve">. </w:t>
-      </w:r>
-      <w:proofErr w:type="spellStart"/>
-      <w:r>
-        <w:rPr>
-          <w:sz w:val="21"/>
-          <w:szCs w:val="21"/>
-        </w:rPr>
-        <w:t>SASRec</w:t>
-      </w:r>
-      <w:proofErr w:type="spellEnd"/>
-      <w:r>
-        <w:rPr>
-          <w:sz w:val="21"/>
-          <w:szCs w:val="21"/>
-        </w:rPr>
-        <w:t xml:space="preserve"> remains a standard sequential recommender [7]. More broadly, reproducibility studies show that baseline performance can depend strongly on training and evaluation choices [17], [18].</w:t>
-      </w:r>
-      <w:r>
-        <w:rPr>
-          <w:sz w:val="21"/>
-          <w:szCs w:val="21"/>
-        </w:rPr>
-        <w:t xml:space="preserve"> </w:t>
-      </w:r>
-      <w:r>
-        <w:rPr>
-          <w:sz w:val="21"/>
-          <w:szCs w:val="21"/>
-        </w:rPr>
-        <w:t>Sequential recommender performance can also continue to change as training data increase [19], making the comparison sensitive to the chosen training point.</w:t>
-      </w:r>
-      <w:r>
-        <w:rPr>
-          <w:sz w:val="21"/>
-          <w:szCs w:val="21"/>
-        </w:rPr>
-        <w:t xml:space="preserve"> </w:t>
-      </w:r>
-      <w:r>
-        <w:rPr>
-          <w:sz w:val="21"/>
-          <w:szCs w:val="21"/>
-        </w:rPr>
-        <w:t>We therefore compare the N-trained</w:t>
-      </w:r>
-      <w:r>
-        <w:rPr>
-          <w:rFonts w:hint="eastAsia"/>
-          <w:sz w:val="21"/>
-          <w:szCs w:val="21"/>
-        </w:rPr>
-        <w:t xml:space="preserve"> LLM</w:t>
-      </w:r>
-      <w:r>
-        <w:rPr>
-          <w:sz w:val="21"/>
-          <w:szCs w:val="21"/>
-        </w:rPr>
-        <w:t xml:space="preserve"> with </w:t>
-      </w:r>
-      <w:proofErr w:type="spellStart"/>
-      <w:r>
-        <w:rPr>
-          <w:sz w:val="21"/>
-          <w:szCs w:val="21"/>
-        </w:rPr>
-        <w:lastRenderedPageBreak/>
         <w:t>SASRec</w:t>
       </w:r>
       <w:proofErr w:type="spellEnd"/>
@@ -1255,13 +1165,8 @@
         </w:rPr>
         <w:t xml:space="preserve"> </w:t>
       </w:r>
-      <w:proofErr w:type="gramStart"/>
-      <w:r>
-        <w:t>From</w:t>
-      </w:r>
-      <w:proofErr w:type="gramEnd"/>
-      <w:r>
-        <w:t xml:space="preserve"> the same underlying sequence, we construct two different prediction tasks: rating-derived preference prediction and next-interaction prediction.</w:t>
+      <w:r>
+        <w:t>From the same underlying sequence, we construct two different prediction tasks: rating-derived preference prediction and next-interaction prediction.</w:t>
       </w:r>
     </w:p>
     <w:p>
@@ -1513,13 +1418,7 @@
               <w:rPr>
                 <w:rFonts w:ascii="Cambria Math" w:hAnsi="Cambria Math"/>
               </w:rPr>
-              <m:t xml:space="preserve">,  </m:t>
-            </m:r>
-            <m:r>
-              <w:rPr>
-                <w:rFonts w:ascii="Cambria Math" w:hAnsi="Cambria Math"/>
-              </w:rPr>
-              <m:t>i</m:t>
+              <m:t>,  i</m:t>
             </m:r>
           </m:e>
         </m:d>
@@ -1676,16 +1575,49 @@
       </w:r>
     </w:p>
     <w:p>
+      <w:r>
+        <w:t>The multitask setting, M1, trains Y and N within a single shared adapter. At evaluation time, the shared adapter is used through the corresponding Y or N interface, denoted by M</w:t>
+      </w:r>
+      <w:r>
+        <w:rPr>
+          <w:rFonts w:hint="eastAsia"/>
+        </w:rPr>
+        <w:t>1</w:t>
+      </w:r>
+      <w:r>
+        <w:t>-Y and M</w:t>
+      </w:r>
+      <w:r>
+        <w:rPr>
+          <w:rFonts w:hint="eastAsia"/>
+        </w:rPr>
+        <w:t>1</w:t>
+      </w:r>
+      <w:r>
+        <w:t xml:space="preserve">-N. </w:t>
+      </w:r>
+      <w:r>
+        <w:t>M1 is compared with each specialist at matched per-task exposure rather than matched total exposure.</w:t>
+      </w:r>
+    </w:p>
+    <w:p>
       <w:pPr>
         <w:rPr>
-          <w:rFonts w:hint="eastAsia"/>
+          <w:b/>
+          <w:bCs/>
         </w:rPr>
       </w:pPr>
       <w:r>
-        <w:t xml:space="preserve">The multitask setting, M1, trains Y and N within a single shared adapter. At evaluation time, the shared adapter is used through the corresponding Y or N interface, denoted by M-Y and M-N. </w:t>
-      </w:r>
-      <w:r>
-        <w:t>M1 is compared with each specialist at matched per-task exposure rather than matched total exposure.</w:t>
+        <w:rPr>
+          <w:b/>
+          <w:bCs/>
+        </w:rPr>
+        <w:t>IV. METHODOLOGY</w:t>
+      </w:r>
+    </w:p>
+    <w:p>
+      <w:r>
+        <w:t>Our pipeline first constructs temporally valid training examples from each user’s interaction sequence, then adapts a common Llama-3.2-3B-Instruct backbone with task-specific prompts. The same base model is used for Y, N, and M1; the difference lies in how examples are constructed, what response is supervised, and how predictions are scored at inference time.</w:t>
       </w:r>
     </w:p>
     <w:p>
@@ -1700,37 +1632,12 @@
           <w:b/>
           <w:bCs/>
         </w:rPr>
-        <w:t>IV. METHODOLOGY</w:t>
-      </w:r>
-    </w:p>
-    <w:p>
-      <w:r>
-        <w:t>Our pipeline first constructs temporally valid training examples from each user’s interaction sequence, then adapts a common Llama-3.2-3B-Instruct backbone with task-specific prompts. The same base model is used for Y, N, and M1; the difference lies in how examples are constructed, what response is supervised, and how predictions are scored at inference time.</w:t>
-      </w:r>
-    </w:p>
-    <w:p>
-      <w:pPr>
-        <w:rPr>
-          <w:b/>
-          <w:bCs/>
-        </w:rPr>
-      </w:pPr>
-      <w:r>
-        <w:rPr>
-          <w:b/>
-          <w:bCs/>
-        </w:rPr>
+        <w:lastRenderedPageBreak/>
         <w:t>A. Temporal Sample Construction</w:t>
       </w:r>
     </w:p>
     <w:p>
-      <w:pPr>
-        <w:rPr>
-          <w:rFonts w:hint="eastAsia"/>
-        </w:rPr>
-      </w:pPr>
-      <w:r>
-        <w:lastRenderedPageBreak/>
+      <w:r>
         <w:t xml:space="preserve">For Y, interactions are grouped by timestamp. </w:t>
       </w:r>
       <w:r>
@@ -1927,7 +1834,25 @@
         </m:d>
       </m:oMath>
       <w:r>
-        <w:t>. For N, the model scores the allowed candidate labels conditioned on the entire candidate list and ranks candidates by their normalized likelihoods. M-Y and M-N use the same scoring procedures with the shared M1 adapter.</w:t>
+        <w:t>. For N, the model scores the allowed candidate labels conditioned on the entire candidate list and ranks candidates by their normalized likelihoods. M</w:t>
+      </w:r>
+      <w:r>
+        <w:rPr>
+          <w:rFonts w:hint="eastAsia"/>
+        </w:rPr>
+        <w:t>1</w:t>
+      </w:r>
+      <w:r>
+        <w:t>-Y and M</w:t>
+      </w:r>
+      <w:r>
+        <w:rPr>
+          <w:rFonts w:hint="eastAsia"/>
+        </w:rPr>
+        <w:t>1</w:t>
+      </w:r>
+      <w:r>
+        <w:t>-N use the same scoring procedures with the shared M1 adapter.</w:t>
       </w:r>
     </w:p>
     <w:p>
@@ -1962,6 +1887,7 @@
           <w:b/>
           <w:bCs/>
         </w:rPr>
+        <w:lastRenderedPageBreak/>
         <w:t>V. EXPERIMENTAL SETUP</w:t>
       </w:r>
     </w:p>
@@ -1977,16 +1903,10 @@
           <w:b/>
           <w:bCs/>
         </w:rPr>
-        <w:lastRenderedPageBreak/>
         <w:t>A. Datasets and Evidence Coverage</w:t>
       </w:r>
     </w:p>
     <w:p>
-      <w:pPr>
-        <w:rPr>
-          <w:rFonts w:hint="eastAsia"/>
-        </w:rPr>
-      </w:pPr>
       <w:r>
         <w:t>MovieLens-1M [23] is used for the main exposure, multitask, and candidate-protocol analyses, while Amazon Musical Instruments [24] provides an additional ranking check.</w:t>
       </w:r>
@@ -2327,7 +2247,16 @@
     </w:p>
     <w:p>
       <w:r>
-        <w:t xml:space="preserve">Y-native evaluation reports AUC, F1, and accuracy. Y-as-ranker, N, and M-N are evaluated with HR@1, NDCG@5, and MRR. </w:t>
+        <w:t>Y-native evaluation reports AUC, F1, and accuracy. Y-as-ranker, N, and M</w:t>
+      </w:r>
+      <w:r>
+        <w:rPr>
+          <w:rFonts w:hint="eastAsia"/>
+        </w:rPr>
+        <w:t>1</w:t>
+      </w:r>
+      <w:r>
+        <w:t xml:space="preserve">-N are evaluated with HR@1, NDCG@5, and MRR. </w:t>
       </w:r>
     </w:p>
     <w:p>
@@ -2341,17 +2270,17 @@
         <w:t xml:space="preserve"> </w:t>
       </w:r>
       <w:r>
-        <w:t>PopMatch-k5 also uses five candidates but samples distractors with popularity close to that of the target based on full-corpus popularity.</w:t>
-      </w:r>
-      <w:r>
-        <w:t xml:space="preserve"> </w:t>
-      </w:r>
-      <w:r>
-        <w:t xml:space="preserve">Models within each comparison use the same </w:t>
+        <w:t xml:space="preserve">PopMatch-k5 </w:t>
       </w:r>
       <w:r>
         <w:lastRenderedPageBreak/>
-        <w:t>candidate lists.</w:t>
+        <w:t>also uses five candidates but samples distractors with popularity close to that of the target based on full-corpus popularity.</w:t>
+      </w:r>
+      <w:r>
+        <w:t xml:space="preserve"> </w:t>
+      </w:r>
+      <w:r>
+        <w:t>Models within each comparison use the same candidate lists.</w:t>
       </w:r>
     </w:p>
     <w:p>
@@ -2499,33 +2428,18 @@
     </w:p>
     <w:p>
       <w:r>
-        <w:t xml:space="preserve">For the Y-side comparison between Y96 and M1-Y96, we use paired user-level bootstrap resampling on the fixed </w:t>
-      </w:r>
-      <w:r>
-        <w:t>seed 42</w:t>
-      </w:r>
-      <w:r>
-        <w:t xml:space="preserve"> models to obtain 95% intervals for AUC, F1, and accuracy </w:t>
-      </w:r>
-      <w:proofErr w:type="gramStart"/>
-      <w:r>
-        <w:t>differences</w:t>
-      </w:r>
-      <w:r>
-        <w:rPr>
-          <w:rFonts w:hint="eastAsia"/>
-        </w:rPr>
-        <w:t>[</w:t>
-      </w:r>
-      <w:proofErr w:type="gramEnd"/>
-      <w:r>
-        <w:rPr>
-          <w:rFonts w:hint="eastAsia"/>
-        </w:rPr>
-        <w:t>25]</w:t>
-      </w:r>
-      <w:r>
-        <w:t xml:space="preserve">. </w:t>
+        <w:t xml:space="preserve">For the </w:t>
+      </w:r>
+      <w:proofErr w:type="spellStart"/>
+      <w:r>
+        <w:t>MovieLens</w:t>
+      </w:r>
+      <w:proofErr w:type="spellEnd"/>
+      <w:r>
+        <w:t xml:space="preserve"> validation comparison between Y96 and M1-Y96, we use paired user-level bootstrap resampling on the fixed seed 42 models to obtain 95% intervals for AUC, F1, and accuracy differences [25].</w:t>
+      </w:r>
+      <w:r>
+        <w:t xml:space="preserve"> </w:t>
       </w:r>
       <w:r>
         <w:t>The full exposure trajectories use seed 42, while seeds 43 and 44 independently replicate Y96, N96, and M1-96 at 96k.</w:t>
@@ -2567,12 +2481,12 @@
           <w:b/>
           <w:bCs/>
         </w:rPr>
+        <w:lastRenderedPageBreak/>
         <w:t>A. Different Supervision and Observed Recommendation Capabilities</w:t>
       </w:r>
     </w:p>
     <w:p>
       <w:r>
-        <w:lastRenderedPageBreak/>
         <w:t xml:space="preserve">On </w:t>
       </w:r>
       <w:proofErr w:type="spellStart"/>
@@ -2695,10 +2609,15 @@
     </w:p>
     <w:p>
       <w:r>
-        <w:t>At 96k exposure, M1-Y is close to Y96 on AUC, F1, and accuracy for seed 42</w:t>
-      </w:r>
-      <w:r>
-        <w:t>; paired user-level bootstrap intervals are positive for F1 but cross zero for AUC and accuracy.</w:t>
+        <w:t xml:space="preserve">On </w:t>
+      </w:r>
+      <w:proofErr w:type="spellStart"/>
+      <w:r>
+        <w:t>MovieLens</w:t>
+      </w:r>
+      <w:proofErr w:type="spellEnd"/>
+      <w:r>
+        <w:t xml:space="preserve"> validation at 96k exposure, M1-Y is close to Y96 on AUC, F1, and accuracy for seed 42; paired user-level bootstrap intervals are positive for F1 but cross zero for AUC and accuracy.</w:t>
       </w:r>
       <w:r>
         <w:t xml:space="preserve"> </w:t>
@@ -2737,6 +2656,7 @@
     </w:p>
     <w:p>
       <w:r>
+        <w:lastRenderedPageBreak/>
         <w:t xml:space="preserve">At 96k, the additional seeds provide a </w:t>
       </w:r>
       <w:proofErr w:type="spellStart"/>
@@ -2757,14 +2677,242 @@
         <w:t xml:space="preserve"> </w:t>
       </w:r>
       <w:r>
+        <w:t>The mean HR@1 deltas are +0.00708 on validation and +0.01072 on test (Table VIII).</w:t>
+      </w:r>
+      <w:r>
+        <w:t xml:space="preserve"> </w:t>
+      </w:r>
+    </w:p>
+    <w:p>
+      <w:pPr>
+        <w:rPr>
+          <w:b/>
+          <w:bCs/>
+        </w:rPr>
+      </w:pPr>
+      <w:r>
+        <w:rPr>
+          <w:b/>
+          <w:bCs/>
+        </w:rPr>
+        <w:t>D. Sensitivity to Alternative Candidate Protocols</w:t>
+      </w:r>
+    </w:p>
+    <w:p>
+      <w:r>
+        <w:t>We next examine whether the 96k N–M1 ranking comparison depends on the candidate protocol.</w:t>
+      </w:r>
+      <w:r>
+        <w:rPr>
+          <w:rFonts w:hint="eastAsia"/>
+        </w:rPr>
+        <w:t xml:space="preserve"> </w:t>
+      </w:r>
+      <w:r>
+        <w:t>K20 produces the largest N–M1 separation at 96k (Table VIII).</w:t>
+      </w:r>
+      <w:r>
+        <w:t xml:space="preserve"> </w:t>
+      </w:r>
+      <w:r>
+        <w:t>PopMatch-k5 produces much smaller gaps, while k50 also favors N but remains closer than k20.</w:t>
+      </w:r>
+    </w:p>
+    <w:p>
+      <w:r>
+        <w:t>Across PopMatch-k5, k20, and k50</w:t>
+      </w:r>
+      <w:r>
+        <w:t xml:space="preserve">, all 54 seed-level deltas are positive, and all 18 split–protocol–metric summaries have 3/3 positive seed directions. </w:t>
+      </w:r>
+      <w:r>
+        <w:t>The direction of the N advantage is stable across the evaluated protocols, while its magnitude is protocol-dependent. Accordingly, we interpret this as protocol sensitivity rather than a candidate-size effect.</w:t>
+      </w:r>
+    </w:p>
+    <w:p>
+      <w:pPr>
+        <w:rPr>
+          <w:b/>
+          <w:bCs/>
+        </w:rPr>
+      </w:pPr>
+      <w:r>
+        <w:rPr>
+          <w:b/>
+          <w:bCs/>
+        </w:rPr>
+        <w:t xml:space="preserve">E. Exposure-Aware Comparison with </w:t>
+      </w:r>
+      <w:proofErr w:type="spellStart"/>
+      <w:r>
+        <w:rPr>
+          <w:b/>
+          <w:bCs/>
+        </w:rPr>
+        <w:t>SASRec</w:t>
+      </w:r>
+      <w:proofErr w:type="spellEnd"/>
+    </w:p>
+    <w:p>
+      <w:r>
+        <w:t xml:space="preserve">The N-trained </w:t>
+      </w:r>
+      <w:r>
+        <w:rPr>
+          <w:rFonts w:hint="eastAsia"/>
+        </w:rPr>
+        <w:t>LLM</w:t>
+      </w:r>
+      <w:r>
+        <w:t xml:space="preserve"> outperforms the evaluated </w:t>
+      </w:r>
+      <w:proofErr w:type="spellStart"/>
+      <w:r>
+        <w:t>SASRec</w:t>
+      </w:r>
+      <w:proofErr w:type="spellEnd"/>
+      <w:r>
+        <w:t xml:space="preserve"> baseline at all four approximately matched downstream task-sample exposure points.</w:t>
+      </w:r>
+      <w:r>
+        <w:t xml:space="preserve"> </w:t>
+      </w:r>
+      <w:proofErr w:type="spellStart"/>
+      <w:r>
+        <w:t>SASRec</w:t>
+      </w:r>
+      <w:proofErr w:type="spellEnd"/>
+      <w:r>
+        <w:t xml:space="preserve"> also improves substantially across these operating points (Table V). </w:t>
+      </w:r>
+      <w:r>
+        <w:t>Between 96k and 200k, the validation HR@1 gap decreases from +0.2957 to +0.1767.</w:t>
+      </w:r>
+      <w:r>
+        <w:rPr>
+          <w:rFonts w:hint="eastAsia"/>
+        </w:rPr>
+        <w:t xml:space="preserve"> </w:t>
+      </w:r>
+      <w:r>
+        <w:t>The test results show the same overall pattern: N remains ahead at every measured point, while the gap is much smaller at the largest exposure.</w:t>
+      </w:r>
+      <w:r>
+        <w:rPr>
+          <w:rFonts w:hint="eastAsia"/>
+        </w:rPr>
+        <w:t xml:space="preserve"> </w:t>
+      </w:r>
+      <w:r>
+        <w:t>Because only downstream task-sample exposure is aligned, these results do not imply matched compute or resource efficiency.</w:t>
+      </w:r>
+    </w:p>
+    <w:p>
+      <w:pPr>
+        <w:rPr>
+          <w:b/>
+          <w:bCs/>
+        </w:rPr>
+      </w:pPr>
+      <w:r>
+        <w:rPr>
+          <w:b/>
+          <w:bCs/>
+        </w:rPr>
+        <w:t>F. Cross-Dataset Directional Validation</w:t>
+      </w:r>
+    </w:p>
+    <w:p>
+      <w:r>
+        <w:t xml:space="preserve">At the available Amazon Musical Instruments operating point, N shows the same ranking direction as on </w:t>
+      </w:r>
+      <w:proofErr w:type="spellStart"/>
+      <w:r>
+        <w:t>MovieLens</w:t>
+      </w:r>
+      <w:proofErr w:type="spellEnd"/>
+      <w:r>
+        <w:t xml:space="preserve">. Under PopMatch-k5, N reaches an HR@1 of 0.4669 and ranks above Base, Y-as-ranker, and </w:t>
+      </w:r>
+      <w:proofErr w:type="spellStart"/>
+      <w:r>
+        <w:t>SASRec</w:t>
+      </w:r>
+      <w:proofErr w:type="spellEnd"/>
+      <w:r>
+        <w:t xml:space="preserve"> (Table IX). The same ordering holds for NDCG@5 and MRR. This serves as a directional cross-dataset check; the full exposure, </w:t>
+      </w:r>
+      <w:proofErr w:type="spellStart"/>
+      <w:r>
+        <w:t>multiseed</w:t>
+      </w:r>
+      <w:proofErr w:type="spellEnd"/>
+      <w:r>
+        <w:t xml:space="preserve">, and protocol analyses remain specific to </w:t>
+      </w:r>
+      <w:proofErr w:type="spellStart"/>
+      <w:r>
+        <w:t>MovieLens</w:t>
+      </w:r>
+      <w:proofErr w:type="spellEnd"/>
+      <w:r>
+        <w:t>.</w:t>
+      </w:r>
+    </w:p>
+    <w:p>
+      <w:pPr>
+        <w:rPr>
+          <w:b/>
+          <w:bCs/>
+        </w:rPr>
+      </w:pPr>
+      <w:r>
+        <w:rPr>
+          <w:b/>
+          <w:bCs/>
+        </w:rPr>
+        <w:t>VII. DISCUSSION</w:t>
+      </w:r>
+    </w:p>
+    <w:p>
+      <w:pPr>
+        <w:rPr>
+          <w:b/>
+          <w:bCs/>
+        </w:rPr>
+      </w:pPr>
+      <w:r>
+        <w:rPr>
+          <w:b/>
+          <w:bCs/>
+        </w:rPr>
+        <w:t>A. Supervision and Observed Capability</w:t>
+      </w:r>
+    </w:p>
+    <w:p>
+      <w:r>
         <w:lastRenderedPageBreak/>
-        <w:t>The mean HR@1 deltas are +0.00708 on validation and +0.01072 on test (Table VIII).</w:t>
-      </w:r>
-      <w:r>
-        <w:t xml:space="preserve"> </w:t>
-      </w:r>
-      <w:r>
-        <w:t>Across the three evaluated seeds, the 96k comparison consistently favors the N specialist in direction.</w:t>
+        <w:t>The Y–N comparison shows that recommendation performance depends on both what the model is trained to predict and how it is evaluated.</w:t>
+      </w:r>
+      <w:r>
+        <w:t xml:space="preserve"> </w:t>
+      </w:r>
+      <w:r>
+        <w:t>Y's strong native preference performance does not carry over to next-interaction ranking through Y-as-ranker.</w:t>
+      </w:r>
+      <w:r>
+        <w:t xml:space="preserve"> In other words, a model can be effective at estimating whether a user likes an item without being equally effective at selecting what the user will interact with next.</w:t>
+      </w:r>
+    </w:p>
+    <w:p>
+      <w:r>
+        <w:t xml:space="preserve">This distinction is especially important for LLM-based recommendation because different tasks can be expressed through superficially similar prompts and response formats. </w:t>
+      </w:r>
+      <w:r>
+        <w:t>Similar language interfaces can still correspond to different targets, eligible events, and scoring rules.</w:t>
+      </w:r>
+      <w:r>
+        <w:t xml:space="preserve"> Capability claims should therefore remain tied to the task on which they are established.</w:t>
       </w:r>
     </w:p>
     <w:p>
@@ -2779,44 +2927,21 @@
           <w:b/>
           <w:bCs/>
         </w:rPr>
-        <w:t>D. Sensitivity to Alternative Candidate Protocols</w:t>
-      </w:r>
-    </w:p>
-    <w:p>
-      <w:r>
-        <w:t>We next examine whether the 96k N–M1 ranking comparison depends on the candidate protocol.</w:t>
-      </w:r>
-      <w:r>
-        <w:rPr>
-          <w:rFonts w:hint="eastAsia"/>
-        </w:rPr>
-        <w:t xml:space="preserve"> </w:t>
-      </w:r>
-      <w:r>
-        <w:t>K20 produces the largest N–M1 separation at 96k (Table VIII).</w:t>
-      </w:r>
-      <w:r>
-        <w:t xml:space="preserve"> </w:t>
-      </w:r>
-      <w:r>
-        <w:t>PopMatch-k5 produces much smaller gaps, while k50 also favors N but remains closer than k20.</w:t>
-      </w:r>
-    </w:p>
-    <w:p>
-      <w:r>
-        <w:t>Across PopMatch-k5, k20, and k50</w:t>
-      </w:r>
-      <w:r>
-        <w:t xml:space="preserve">, all 54 seed-level deltas are positive, and all 18 split–protocol–metric summaries have 3/3 positive seed directions. </w:t>
-      </w:r>
-      <w:r>
-        <w:t>The direction of the N advantage is stable across the evaluated protocols, while its magnitude is protocol-dependent.</w:t>
-      </w:r>
-      <w:r>
-        <w:t xml:space="preserve"> </w:t>
-      </w:r>
-      <w:r>
-        <w:t>Accordingly, we interpret this as protocol sensitivity rather than a candidate-size effect.</w:t>
+        <w:t>B. Exposure and Specialist–Multitask Modeling</w:t>
+      </w:r>
+    </w:p>
+    <w:p>
+      <w:r>
+        <w:t xml:space="preserve">The exposure trajectories show that a single checkpoint can give an incomplete picture of model behavior. </w:t>
+      </w:r>
+      <w:r>
+        <w:t>The different Y and N trajectories further show that training progress is task dependent.</w:t>
+      </w:r>
+      <w:r>
+        <w:t xml:space="preserve"> </w:t>
+      </w:r>
+      <w:r>
+        <w:t>The observed specialist–shared gap can likewise depend on the exposure point being examined.</w:t>
       </w:r>
     </w:p>
     <w:p>
@@ -2827,11 +2952,68 @@
         </w:rPr>
       </w:pPr>
       <w:r>
-        <w:rPr>
-          <w:b/>
-          <w:bCs/>
-        </w:rPr>
-        <w:t xml:space="preserve">E. Exposure-Aware Comparison with </w:t>
+        <w:t>Shared adaptation affects the two tasks differently. At 96k exposure, M1-Y remains close to the Y specialist on preference prediction, consistent with Y-side capability preservation. On the N side, the specialist remains ahead. The seed 42 validation gap narrows from 48k to 96k, but the same pattern is absent on the held-out test set, and all three seeds at 96k still favor N. The available evidence therefore does not establish convergence between N and M1-N.</w:t>
+      </w:r>
+      <w:r>
+        <w:rPr>
+          <w:b/>
+          <w:bCs/>
+        </w:rPr>
+        <w:t xml:space="preserve"> </w:t>
+      </w:r>
+    </w:p>
+    <w:p>
+      <w:pPr>
+        <w:rPr>
+          <w:b/>
+          <w:bCs/>
+        </w:rPr>
+      </w:pPr>
+      <w:r>
+        <w:rPr>
+          <w:b/>
+          <w:bCs/>
+        </w:rPr>
+        <w:t>C. Sensitivity to Candidate Protocol</w:t>
+      </w:r>
+    </w:p>
+    <w:p>
+      <w:pPr>
+        <w:rPr>
+          <w:b/>
+          <w:bCs/>
+        </w:rPr>
+      </w:pPr>
+      <w:r>
+        <w:t xml:space="preserve">The N–M1 comparison also depends on the evaluation protocol. N remains ahead across all evaluated protocols and training seeds, while the size of the gap varies. </w:t>
+      </w:r>
+      <w:r>
+        <w:t>The measured N–M1 gap therefore varies more in magnitude than in direction across candidate constructions.</w:t>
+      </w:r>
+      <w:r>
+        <w:t xml:space="preserve"> Because the protocols are non-nested and differ in sampling, composition, and difficulty, the result should be interpreted as evaluation-protocol sensitivity rather than a candidate-size effect.</w:t>
+      </w:r>
+      <w:r>
+        <w:rPr>
+          <w:b/>
+          <w:bCs/>
+        </w:rPr>
+        <w:t xml:space="preserve"> </w:t>
+      </w:r>
+    </w:p>
+    <w:p>
+      <w:pPr>
+        <w:rPr>
+          <w:b/>
+          <w:bCs/>
+        </w:rPr>
+      </w:pPr>
+      <w:r>
+        <w:rPr>
+          <w:b/>
+          <w:bCs/>
+        </w:rPr>
+        <w:t xml:space="preserve">D. Comparison with </w:t>
       </w:r>
       <w:proofErr w:type="spellStart"/>
       <w:r>
@@ -2845,7 +3027,18 @@
     </w:p>
     <w:p>
       <w:r>
-        <w:t xml:space="preserve">The N-trained </w:t>
+        <w:t xml:space="preserve">The exposure-aligned comparison with </w:t>
+      </w:r>
+      <w:proofErr w:type="spellStart"/>
+      <w:r>
+        <w:t>SASRec</w:t>
+      </w:r>
+      <w:proofErr w:type="spellEnd"/>
+      <w:r>
+        <w:t xml:space="preserve"> provides a different reference point for the N trajectory. </w:t>
+      </w:r>
+      <w:r>
+        <w:t xml:space="preserve">The cross-model gap changes with training exposure even though the N-trained </w:t>
       </w:r>
       <w:r>
         <w:rPr>
@@ -2854,7 +3047,19 @@
         <w:t>LLM</w:t>
       </w:r>
       <w:r>
-        <w:t xml:space="preserve"> outperforms the evaluated </w:t>
+        <w:t xml:space="preserve"> remains ahead at all four measured points.</w:t>
+      </w:r>
+      <w:r>
+        <w:t xml:space="preserve"> </w:t>
+      </w:r>
+      <w:r>
+        <w:rPr>
+          <w:rFonts w:hint="eastAsia"/>
+        </w:rPr>
+        <w:t>T</w:t>
+      </w:r>
+      <w:r>
+        <w:t xml:space="preserve">he evaluated </w:t>
       </w:r>
       <w:proofErr w:type="spellStart"/>
       <w:r>
@@ -2862,42 +3067,25 @@
       </w:r>
       <w:proofErr w:type="spellEnd"/>
       <w:r>
-        <w:t xml:space="preserve"> baseline at all four approximately matched downstream task-sample exposure points.</w:t>
-      </w:r>
-      <w:r>
-        <w:t xml:space="preserve"> </w:t>
-      </w:r>
-      <w:proofErr w:type="spellStart"/>
-      <w:r>
-        <w:t>SASRec</w:t>
-      </w:r>
-      <w:proofErr w:type="spellEnd"/>
-      <w:r>
-        <w:t xml:space="preserve"> also improves substantially across these operating points (Table V).</w:t>
-      </w:r>
-      <w:r>
-        <w:t xml:space="preserve"> </w:t>
-      </w:r>
-      <w:r>
-        <w:t>The validation HR@1 gap decreases from +0.2957 at 96k to +0.1767 at 200k.</w:t>
-      </w:r>
-      <w:r>
-        <w:rPr>
-          <w:rFonts w:hint="eastAsia"/>
-        </w:rPr>
-        <w:t xml:space="preserve"> </w:t>
-      </w:r>
-      <w:r>
-        <w:t>The test results show the same overall pattern: N remains ahead at every measured point, while the gap is much smaller at the largest exposure.</w:t>
-      </w:r>
-      <w:r>
-        <w:rPr>
-          <w:rFonts w:hint="eastAsia"/>
-        </w:rPr>
-        <w:t xml:space="preserve"> </w:t>
-      </w:r>
-      <w:r>
-        <w:t>Because only downstream task-sample exposure is aligned, these results do not imply matched compute or resource efficiency.</w:t>
+        <w:t xml:space="preserve"> </w:t>
+      </w:r>
+      <w:r>
+        <w:lastRenderedPageBreak/>
+        <w:t>baseline</w:t>
+      </w:r>
+      <w:r>
+        <w:t xml:space="preserve"> improves substantially as it receives more recommendation training data, and the difference is considerably smaller at 200k than at earlier operating points.</w:t>
+      </w:r>
+    </w:p>
+    <w:p>
+      <w:r>
+        <w:t>This cautions against treating a single low-exposure comparison as a fixed gap between the two evaluated approaches.</w:t>
+      </w:r>
+      <w:r>
+        <w:t xml:space="preserve"> </w:t>
+      </w:r>
+      <w:r>
+        <w:t>Task-sample exposure aligns downstream recommendation examples, but it does not make the two training pipelines computationally comparable.</w:t>
       </w:r>
     </w:p>
     <w:p>
@@ -2912,12 +3100,12 @@
           <w:b/>
           <w:bCs/>
         </w:rPr>
-        <w:t>F. Cross-Dataset Directional Validation</w:t>
-      </w:r>
-    </w:p>
-    <w:p>
-      <w:r>
-        <w:t xml:space="preserve">At the available Amazon Musical Instruments operating point, N shows the same ranking direction as on </w:t>
+        <w:t>VIII. LIMITATIONS</w:t>
+      </w:r>
+    </w:p>
+    <w:p>
+      <w:r>
+        <w:t xml:space="preserve">The complete </w:t>
       </w:r>
       <w:proofErr w:type="spellStart"/>
       <w:r>
@@ -2925,294 +3113,13 @@
       </w:r>
       <w:proofErr w:type="spellEnd"/>
       <w:r>
-        <w:t xml:space="preserve">. Under PopMatch-k5, N reaches an HR@1 of 0.4669 and ranks above Base, Y-as-ranker, and </w:t>
-      </w:r>
-      <w:proofErr w:type="spellStart"/>
-      <w:r>
-        <w:t>SASRec</w:t>
-      </w:r>
-      <w:proofErr w:type="spellEnd"/>
-      <w:r>
-        <w:t xml:space="preserve"> (Table IX). The same ordering holds for NDCG@5 and MRR. This serves as a directional cross-dataset check; the full exposure, </w:t>
-      </w:r>
-      <w:proofErr w:type="spellStart"/>
-      <w:r>
-        <w:t>multiseed</w:t>
-      </w:r>
-      <w:proofErr w:type="spellEnd"/>
-      <w:r>
-        <w:t xml:space="preserve">, and protocol analyses remain specific to </w:t>
-      </w:r>
-      <w:proofErr w:type="spellStart"/>
-      <w:r>
-        <w:t>MovieLens</w:t>
-      </w:r>
-      <w:proofErr w:type="spellEnd"/>
-      <w:r>
-        <w:t>.</w:t>
-      </w:r>
-    </w:p>
-    <w:p>
-      <w:pPr>
-        <w:rPr>
-          <w:b/>
-          <w:bCs/>
-        </w:rPr>
-      </w:pPr>
-      <w:r>
-        <w:rPr>
-          <w:b/>
-          <w:bCs/>
-        </w:rPr>
-        <w:t>VII. DISCUSSION</w:t>
-      </w:r>
-    </w:p>
-    <w:p>
-      <w:pPr>
-        <w:rPr>
-          <w:b/>
-          <w:bCs/>
-        </w:rPr>
-      </w:pPr>
-      <w:r>
-        <w:rPr>
-          <w:b/>
-          <w:bCs/>
-        </w:rPr>
-        <w:t>A. Supervision and Observed Capability</w:t>
-      </w:r>
-    </w:p>
-    <w:p>
-      <w:r>
-        <w:t xml:space="preserve">The Y–N comparison shows that recommendation performance depends on both what </w:t>
-      </w:r>
-      <w:r>
-        <w:lastRenderedPageBreak/>
-        <w:t>the model is trained to predict and how it is evaluated.</w:t>
-      </w:r>
-      <w:r>
-        <w:t xml:space="preserve"> </w:t>
-      </w:r>
-      <w:r>
-        <w:t>Y's strong native preference performance does not carry over to next-interaction ranking through Y-as-ranker.</w:t>
-      </w:r>
-      <w:r>
-        <w:t xml:space="preserve"> In other words, a model can be effective at estimating whether a user likes an item without being equally effective at selecting what the user will interact with next.</w:t>
-      </w:r>
-    </w:p>
-    <w:p>
-      <w:r>
-        <w:t xml:space="preserve">This distinction is especially important for LLM-based recommendation because different tasks can be expressed through superficially similar prompts and response formats. </w:t>
-      </w:r>
-      <w:r>
-        <w:t>Similar language interfaces can still correspond to different targets, eligible events, and scoring rules.</w:t>
-      </w:r>
-      <w:r>
-        <w:t xml:space="preserve"> Capability claims should therefore remain tied to the task on which they are established.</w:t>
-      </w:r>
-    </w:p>
-    <w:p>
-      <w:pPr>
-        <w:rPr>
-          <w:b/>
-          <w:bCs/>
-        </w:rPr>
-      </w:pPr>
-      <w:r>
-        <w:rPr>
-          <w:b/>
-          <w:bCs/>
-        </w:rPr>
-        <w:t>B. Exposure and Specialist–Multitask Modeling</w:t>
-      </w:r>
-    </w:p>
-    <w:p>
-      <w:r>
-        <w:t xml:space="preserve">The exposure trajectories show that a single checkpoint can give an incomplete picture of model behavior. </w:t>
-      </w:r>
-      <w:r>
-        <w:t>The different Y and N trajectories further show that training progress is task dependent.</w:t>
-      </w:r>
-      <w:r>
-        <w:t xml:space="preserve"> </w:t>
-      </w:r>
-      <w:r>
-        <w:t>The observed specialist–shared gap can likewise depend on the exposure point being examined.</w:t>
-      </w:r>
-    </w:p>
-    <w:p>
-      <w:pPr>
-        <w:rPr>
-          <w:b/>
-          <w:bCs/>
-        </w:rPr>
-      </w:pPr>
-      <w:r>
-        <w:t>Shared adaptation affects the two tasks differently. At 96k exposure, M1-Y remains close to the Y specialist on preference prediction, consistent with Y-side capability preservation. On the N side, the specialist remains ahead. The seed 42 validation gap narrows from 48k to 96k, but the same pattern is absent on the held-out test set, and all three seeds at 96k still favor N. The available evidence therefore does not establish convergence between N and M1-N.</w:t>
-      </w:r>
-      <w:r>
-        <w:rPr>
-          <w:b/>
-          <w:bCs/>
-        </w:rPr>
-        <w:t xml:space="preserve"> </w:t>
-      </w:r>
-    </w:p>
-    <w:p>
-      <w:pPr>
-        <w:rPr>
-          <w:b/>
-          <w:bCs/>
-        </w:rPr>
-      </w:pPr>
-      <w:r>
-        <w:rPr>
-          <w:b/>
-          <w:bCs/>
-        </w:rPr>
-        <w:t>C. Sensitivity to Candidate Protocol</w:t>
-      </w:r>
-    </w:p>
-    <w:p>
-      <w:pPr>
-        <w:rPr>
-          <w:b/>
-          <w:bCs/>
-        </w:rPr>
-      </w:pPr>
-      <w:r>
-        <w:t>The N–M1 comparison also depends on the evaluation protocol. N remains ahead across all evaluated protocols and training seeds, while the size of the gap varies. Candidate construction therefore changes the measured size of the N–M1 gap more than its observed direction. Because the protocols are non-nested and differ in sampling, composition, and difficulty, the result should be interpreted as evaluation-protocol sensitivity rather than a candidate-size effect.</w:t>
-      </w:r>
-      <w:r>
-        <w:rPr>
-          <w:b/>
-          <w:bCs/>
-        </w:rPr>
-        <w:t xml:space="preserve"> </w:t>
-      </w:r>
-    </w:p>
-    <w:p>
-      <w:pPr>
-        <w:rPr>
-          <w:b/>
-          <w:bCs/>
-        </w:rPr>
-      </w:pPr>
-      <w:r>
-        <w:rPr>
-          <w:b/>
-          <w:bCs/>
-        </w:rPr>
-        <w:t xml:space="preserve">D. Comparison with </w:t>
-      </w:r>
-      <w:proofErr w:type="spellStart"/>
-      <w:r>
-        <w:rPr>
-          <w:b/>
-          <w:bCs/>
-        </w:rPr>
-        <w:t>SASRec</w:t>
-      </w:r>
-      <w:proofErr w:type="spellEnd"/>
-    </w:p>
-    <w:p>
-      <w:r>
-        <w:t xml:space="preserve">The exposure-aligned comparison with </w:t>
-      </w:r>
-      <w:proofErr w:type="spellStart"/>
-      <w:r>
-        <w:t>SASRec</w:t>
-      </w:r>
-      <w:proofErr w:type="spellEnd"/>
-      <w:r>
-        <w:t xml:space="preserve"> provides a different reference point for the N trajectory. </w:t>
-      </w:r>
-      <w:r>
-        <w:t xml:space="preserve">The cross-model gap changes with training exposure even though the N-trained </w:t>
-      </w:r>
-      <w:r>
-        <w:rPr>
-          <w:rFonts w:hint="eastAsia"/>
-        </w:rPr>
-        <w:t>LLM</w:t>
-      </w:r>
-      <w:r>
-        <w:t xml:space="preserve"> remains ahead at all four measured points.</w:t>
-      </w:r>
-      <w:r>
-        <w:t xml:space="preserve"> </w:t>
-      </w:r>
-      <w:r>
-        <w:rPr>
-          <w:rFonts w:hint="eastAsia"/>
-        </w:rPr>
-        <w:t>T</w:t>
-      </w:r>
-      <w:r>
-        <w:t xml:space="preserve">he evaluated </w:t>
-      </w:r>
-      <w:proofErr w:type="spellStart"/>
-      <w:r>
-        <w:t>SASRec</w:t>
-      </w:r>
-      <w:proofErr w:type="spellEnd"/>
-      <w:r>
-        <w:t xml:space="preserve"> baseline</w:t>
-      </w:r>
-      <w:r>
-        <w:t xml:space="preserve"> improves substantially as it receives more recommendation training data, and </w:t>
-      </w:r>
-      <w:r>
-        <w:lastRenderedPageBreak/>
-        <w:t>the difference is considerably smaller at 200k than at earlier operating points.</w:t>
-      </w:r>
-    </w:p>
-    <w:p>
-      <w:r>
-        <w:t>This cautions against treating a single low-exposure comparison as a fixed gap between the two evaluated approaches.</w:t>
-      </w:r>
-      <w:r>
-        <w:t xml:space="preserve"> </w:t>
-      </w:r>
-      <w:r>
-        <w:t>Task-sample exposure aligns downstream recommendation examples, but it does not make the two training pipelines computationally comparable.</w:t>
-      </w:r>
-    </w:p>
-    <w:p>
-      <w:pPr>
-        <w:rPr>
-          <w:b/>
-          <w:bCs/>
-        </w:rPr>
-      </w:pPr>
-      <w:r>
-        <w:rPr>
-          <w:b/>
-          <w:bCs/>
-        </w:rPr>
-        <w:t>VIII. LIMITATIONS</w:t>
-      </w:r>
-    </w:p>
-    <w:p>
-      <w:r>
-        <w:t xml:space="preserve">The complete </w:t>
-      </w:r>
-      <w:proofErr w:type="spellStart"/>
-      <w:r>
-        <w:t>MovieLens</w:t>
-      </w:r>
-      <w:proofErr w:type="spellEnd"/>
-      <w:r>
         <w:t xml:space="preserve"> exposure trajectories are available only for training seed 42.</w:t>
       </w:r>
       <w:r>
-        <w:t xml:space="preserve"> Seeds 43 and 44 replicate the 96k operating point, but not the full 24k-to-200k trajectory. </w:t>
-      </w:r>
-      <w:r>
-        <w:t>Seeds 43 and 44 strengthen the 96k endpoint comparison, while the exposure trajectories remain specific to seed 42</w:t>
-      </w:r>
-      <w:r>
-        <w:t>.</w:t>
+        <w:t xml:space="preserve"> </w:t>
+      </w:r>
+      <w:r>
+        <w:t>Seeds 43 and 44 replicate the 96k operating point, strengthening the endpoint comparison while leaving the full exposure trajectories specific to seed 42.</w:t>
       </w:r>
     </w:p>
     <w:p>
@@ -3340,10 +3247,7 @@
         <w:t xml:space="preserve"> learns its sequence representation from recommendation data. </w:t>
       </w:r>
       <w:r>
-        <w:t>The comparison does not align total training or serving cost.</w:t>
-      </w:r>
-      <w:r>
-        <w:t xml:space="preserve"> </w:t>
+        <w:t xml:space="preserve">The comparison does not align total training or serving cost. </w:t>
       </w:r>
       <w:proofErr w:type="spellStart"/>
       <w:r>
@@ -3404,12 +3308,21 @@
         <w:t xml:space="preserve">This study examined how different recommendation objectives behave under LLM adaptation and how their relationship changes when training is shared across tasks. </w:t>
       </w:r>
       <w:r>
-        <w:t>Rating-derived preference prediction and next-interaction prediction produce different observed capabilities: Y performs well on native preference discrimination but is much less effective when used for next-interaction ranking, while N continues to improve over the evaluated downstream exposure range.</w:t>
-      </w:r>
-    </w:p>
-    <w:p>
-      <w:r>
-        <w:t xml:space="preserve">The shared Y+N adapter preserves much of the Y-side preference capability, but N remains the stronger ranking specialist. </w:t>
+        <w:t xml:space="preserve">Rating-derived preference prediction and next-interaction prediction produce different observed capabilities: </w:t>
+      </w:r>
+      <w:r>
+        <w:t>Y performs well on native preference discrimination, but this performance does not carry over to next-interaction ranking</w:t>
+      </w:r>
+      <w:r>
+        <w:t>, while N continues to improve over the evaluated downstream exposure range.</w:t>
+      </w:r>
+    </w:p>
+    <w:p>
+      <w:r>
+        <w:t>M1-Y remains close to the Y specialist on preference prediction, while N remains the stronger ranking specialist.</w:t>
+      </w:r>
+      <w:r>
+        <w:t xml:space="preserve"> </w:t>
       </w:r>
       <w:r>
         <w:t>At 96k, all three evaluated training seeds favor N over M1-N.</w:t>

</xml_diff>